<commit_message>
docs: Add process flow diagram, fix table styling
- Embed NPSP Donation Processing flowchart (blue boxes, numbered steps)
- Fix all 14 tables: gray headers (AEAAAA) with white bold text
- Add alternating row shading (white/light gray F2F2F2)
- CRUD matrix sub-header row properly styled

Co-Authored-By: Erik Rozi <erik.rozi@cognition.ai>
</commit_message>
<xml_diff>
--- a/documentation/NPSP_Technical_Design_Document_2025-05-14.docx
+++ b/documentation/NPSP_Technical_Design_Document_2025-05-14.docx
@@ -512,6 +512,7 @@
         <w:tc>
           <w:tcPr>
             <w:tcW w:w="1072" w:type="dxa"/>
+            <w:shd w:fill="AEAAAA" w:val="clear"/>
           </w:tcPr>
           <w:p>
             <w:pPr>
@@ -531,7 +532,8 @@
             <w:r>
               <w:rPr>
                 <w:rFonts w:ascii="Times New Roman" w:hAnsi="Times New Roman" w:cs="Times New Roman"/>
-                <w:color w:val="000000" w:themeColor="text1"/>
+                <w:b/>
+                <w:color w:val="FFFFFF"/>
                 <w:sz w:val="24"/>
                 <w:szCs w:val="24"/>
                 <w:lang w:val="en-US"/>
@@ -543,6 +545,7 @@
         <w:tc>
           <w:tcPr>
             <w:tcW w:w="1381" w:type="dxa"/>
+            <w:shd w:fill="AEAAAA" w:val="clear"/>
           </w:tcPr>
           <w:p>
             <w:pPr>
@@ -562,7 +565,8 @@
             <w:r>
               <w:rPr>
                 <w:rFonts w:ascii="Times New Roman" w:hAnsi="Times New Roman" w:cs="Times New Roman"/>
-                <w:color w:val="000000" w:themeColor="text1"/>
+                <w:b/>
+                <w:color w:val="FFFFFF"/>
                 <w:sz w:val="24"/>
                 <w:szCs w:val="24"/>
                 <w:lang w:val="en-US"/>
@@ -574,6 +578,7 @@
         <w:tc>
           <w:tcPr>
             <w:tcW w:w="2294" w:type="dxa"/>
+            <w:shd w:fill="AEAAAA" w:val="clear"/>
           </w:tcPr>
           <w:p>
             <w:pPr>
@@ -593,7 +598,8 @@
             <w:r>
               <w:rPr>
                 <w:rFonts w:ascii="Times New Roman" w:hAnsi="Times New Roman" w:cs="Times New Roman"/>
-                <w:color w:val="000000" w:themeColor="text1"/>
+                <w:b/>
+                <w:color w:val="FFFFFF"/>
                 <w:sz w:val="24"/>
                 <w:szCs w:val="24"/>
                 <w:lang w:val="en-US"/>
@@ -605,6 +611,7 @@
         <w:tc>
           <w:tcPr>
             <w:tcW w:w="4743" w:type="dxa"/>
+            <w:shd w:fill="AEAAAA" w:val="clear"/>
           </w:tcPr>
           <w:p>
             <w:pPr>
@@ -623,7 +630,8 @@
             <w:r>
               <w:rPr>
                 <w:rFonts w:ascii="Times New Roman" w:hAnsi="Times New Roman" w:cs="Times New Roman"/>
-                <w:color w:val="000000" w:themeColor="text1"/>
+                <w:b/>
+                <w:color w:val="FFFFFF"/>
                 <w:sz w:val="24"/>
                 <w:szCs w:val="24"/>
                 <w:lang w:val="en-US"/>
@@ -7774,6 +7782,7 @@
           <w:tcPr>
             <w:cnfStyle w:val="001000000000" w:firstRow="0" w:lastRow="0" w:firstColumn="1" w:lastColumn="0" w:oddVBand="0" w:evenVBand="0" w:oddHBand="0" w:evenHBand="0" w:firstRowFirstColumn="0" w:firstRowLastColumn="0" w:lastRowFirstColumn="0" w:lastRowLastColumn="0"/>
             <w:tcW w:w="2518" w:type="dxa"/>
+            <w:shd w:fill="AEAAAA" w:val="clear"/>
           </w:tcPr>
           <w:p>
             <w:pPr>
@@ -7788,6 +7797,8 @@
             <w:r>
               <w:rPr>
                 <w:rFonts w:ascii="Times New Roman" w:hAnsi="Times New Roman" w:cs="Times New Roman"/>
+                <w:b/>
+                <w:color w:val="FFFFFF"/>
                 <w:sz w:val="24"/>
                 <w:szCs w:val="24"/>
                 <w:lang w:val="en-US"/>
@@ -7799,6 +7810,7 @@
         <w:tc>
           <w:tcPr>
             <w:tcW w:w="6694" w:type="dxa"/>
+            <w:shd w:fill="AEAAAA" w:val="clear"/>
           </w:tcPr>
           <w:p>
             <w:pPr>
@@ -7814,6 +7826,8 @@
             <w:r>
               <w:rPr>
                 <w:rFonts w:ascii="Times New Roman" w:hAnsi="Times New Roman" w:cs="Times New Roman"/>
+                <w:b/>
+                <w:color w:val="FFFFFF"/>
                 <w:sz w:val="24"/>
                 <w:szCs w:val="24"/>
                 <w:lang w:val="en-US"/>
@@ -7849,6 +7863,7 @@
         <w:tc>
           <w:tcPr>
             <w:tcW w:type="dxa" w:w="2594"/>
+            <w:shd w:fill="F2F2F2" w:val="clear"/>
           </w:tcPr>
           <w:p>
             <w:r>
@@ -7859,6 +7874,7 @@
         <w:tc>
           <w:tcPr>
             <w:tcW w:type="dxa" w:w="6896"/>
+            <w:shd w:fill="F2F2F2" w:val="clear"/>
           </w:tcPr>
           <w:p>
             <w:r>
@@ -7893,6 +7909,7 @@
         <w:tc>
           <w:tcPr>
             <w:tcW w:type="dxa" w:w="2594"/>
+            <w:shd w:fill="F2F2F2" w:val="clear"/>
           </w:tcPr>
           <w:p>
             <w:r>
@@ -7903,6 +7920,7 @@
         <w:tc>
           <w:tcPr>
             <w:tcW w:type="dxa" w:w="6896"/>
+            <w:shd w:fill="F2F2F2" w:val="clear"/>
           </w:tcPr>
           <w:p>
             <w:r>
@@ -7937,6 +7955,7 @@
         <w:tc>
           <w:tcPr>
             <w:tcW w:type="dxa" w:w="2594"/>
+            <w:shd w:fill="F2F2F2" w:val="clear"/>
           </w:tcPr>
           <w:p>
             <w:r>
@@ -7947,6 +7966,7 @@
         <w:tc>
           <w:tcPr>
             <w:tcW w:type="dxa" w:w="6896"/>
+            <w:shd w:fill="F2F2F2" w:val="clear"/>
           </w:tcPr>
           <w:p>
             <w:r>
@@ -7981,6 +8001,7 @@
         <w:tc>
           <w:tcPr>
             <w:tcW w:type="dxa" w:w="2594"/>
+            <w:shd w:fill="F2F2F2" w:val="clear"/>
           </w:tcPr>
           <w:p>
             <w:r>
@@ -7991,6 +8012,7 @@
         <w:tc>
           <w:tcPr>
             <w:tcW w:type="dxa" w:w="6896"/>
+            <w:shd w:fill="F2F2F2" w:val="clear"/>
           </w:tcPr>
           <w:p>
             <w:r>
@@ -8025,6 +8047,7 @@
         <w:tc>
           <w:tcPr>
             <w:tcW w:type="dxa" w:w="2594"/>
+            <w:shd w:fill="F2F2F2" w:val="clear"/>
           </w:tcPr>
           <w:p>
             <w:r>
@@ -8035,6 +8058,7 @@
         <w:tc>
           <w:tcPr>
             <w:tcW w:type="dxa" w:w="6896"/>
+            <w:shd w:fill="F2F2F2" w:val="clear"/>
           </w:tcPr>
           <w:p>
             <w:r>
@@ -8069,6 +8093,7 @@
         <w:tc>
           <w:tcPr>
             <w:tcW w:type="dxa" w:w="2594"/>
+            <w:shd w:fill="F2F2F2" w:val="clear"/>
           </w:tcPr>
           <w:p>
             <w:r>
@@ -8079,6 +8104,7 @@
         <w:tc>
           <w:tcPr>
             <w:tcW w:type="dxa" w:w="6896"/>
+            <w:shd w:fill="F2F2F2" w:val="clear"/>
           </w:tcPr>
           <w:p>
             <w:r>
@@ -8113,6 +8139,7 @@
         <w:tc>
           <w:tcPr>
             <w:tcW w:type="dxa" w:w="2594"/>
+            <w:shd w:fill="F2F2F2" w:val="clear"/>
           </w:tcPr>
           <w:p>
             <w:r>
@@ -8123,6 +8150,7 @@
         <w:tc>
           <w:tcPr>
             <w:tcW w:type="dxa" w:w="6896"/>
+            <w:shd w:fill="F2F2F2" w:val="clear"/>
           </w:tcPr>
           <w:p>
             <w:r>
@@ -8157,6 +8185,7 @@
         <w:tc>
           <w:tcPr>
             <w:tcW w:type="dxa" w:w="2594"/>
+            <w:shd w:fill="F2F2F2" w:val="clear"/>
           </w:tcPr>
           <w:p>
             <w:r>
@@ -8167,6 +8196,7 @@
         <w:tc>
           <w:tcPr>
             <w:tcW w:type="dxa" w:w="6896"/>
+            <w:shd w:fill="F2F2F2" w:val="clear"/>
           </w:tcPr>
           <w:p>
             <w:r>
@@ -9082,6 +9112,7 @@
             <w:cnfStyle w:val="001000000000" w:firstRow="0" w:lastRow="0" w:firstColumn="1" w:lastColumn="0" w:oddVBand="0" w:evenVBand="0" w:oddHBand="0" w:evenHBand="0" w:firstRowFirstColumn="0" w:firstRowLastColumn="0" w:lastRowFirstColumn="0" w:lastRowLastColumn="0"/>
             <w:tcW w:w="3865" w:type="dxa"/>
             <w:hideMark/>
+            <w:shd w:fill="AEAAAA" w:val="clear"/>
           </w:tcPr>
           <w:p>
             <w:pPr>
@@ -9098,6 +9129,7 @@
             <w:r>
               <w:rPr>
                 <w:rFonts w:ascii="Times New Roman" w:eastAsia="Times New Roman" w:hAnsi="Times New Roman" w:cs="Times New Roman"/>
+                <w:b/>
                 <w:color w:val="FFFFFF"/>
                 <w:sz w:val="24"/>
                 <w:szCs w:val="24"/>
@@ -9111,6 +9143,7 @@
           <w:tcPr>
             <w:tcW w:w="1785" w:type="dxa"/>
             <w:hideMark/>
+            <w:shd w:fill="AEAAAA" w:val="clear"/>
           </w:tcPr>
           <w:p>
             <w:pPr>
@@ -9128,6 +9161,7 @@
             <w:r>
               <w:rPr>
                 <w:rFonts w:ascii="Times New Roman" w:eastAsia="Times New Roman" w:hAnsi="Times New Roman" w:cs="Times New Roman"/>
+                <w:b/>
                 <w:color w:val="FFFFFF"/>
                 <w:sz w:val="24"/>
                 <w:szCs w:val="24"/>
@@ -9141,6 +9175,7 @@
           <w:tcPr>
             <w:tcW w:w="1842" w:type="dxa"/>
             <w:hideMark/>
+            <w:shd w:fill="AEAAAA" w:val="clear"/>
           </w:tcPr>
           <w:p>
             <w:pPr>
@@ -9158,6 +9193,7 @@
             <w:r>
               <w:rPr>
                 <w:rFonts w:ascii="Times New Roman" w:eastAsia="Times New Roman" w:hAnsi="Times New Roman" w:cs="Times New Roman"/>
+                <w:b/>
                 <w:color w:val="FFFFFF"/>
                 <w:sz w:val="24"/>
                 <w:szCs w:val="24"/>
@@ -9171,6 +9207,7 @@
           <w:tcPr>
             <w:tcW w:w="1843" w:type="dxa"/>
             <w:hideMark/>
+            <w:shd w:fill="AEAAAA" w:val="clear"/>
           </w:tcPr>
           <w:p>
             <w:pPr>
@@ -9188,6 +9225,7 @@
             <w:r>
               <w:rPr>
                 <w:rFonts w:ascii="Times New Roman" w:eastAsia="Times New Roman" w:hAnsi="Times New Roman" w:cs="Times New Roman"/>
+                <w:b/>
                 <w:color w:val="FFFFFF"/>
                 <w:sz w:val="24"/>
                 <w:szCs w:val="24"/>
@@ -9198,6 +9236,7 @@
             <w:r>
               <w:rPr>
                 <w:rFonts w:ascii="Times New Roman" w:eastAsia="Times New Roman" w:hAnsi="Times New Roman" w:cs="Times New Roman"/>
+                <w:b/>
                 <w:color w:val="FFFFFF"/>
                 <w:sz w:val="24"/>
                 <w:szCs w:val="24"/>
@@ -9251,6 +9290,7 @@
         <w:tc>
           <w:tcPr>
             <w:tcW w:type="dxa" w:w="3928"/>
+            <w:shd w:fill="F2F2F2" w:val="clear"/>
           </w:tcPr>
           <w:p>
             <w:r>
@@ -9261,6 +9301,7 @@
         <w:tc>
           <w:tcPr>
             <w:tcW w:type="dxa" w:w="1815"/>
+            <w:shd w:fill="F2F2F2" w:val="clear"/>
           </w:tcPr>
           <w:p>
             <w:r/>
@@ -9269,6 +9310,7 @@
         <w:tc>
           <w:tcPr>
             <w:tcW w:type="dxa" w:w="1873"/>
+            <w:shd w:fill="F2F2F2" w:val="clear"/>
           </w:tcPr>
           <w:p>
             <w:r/>
@@ -9277,6 +9319,7 @@
         <w:tc>
           <w:tcPr>
             <w:tcW w:type="dxa" w:w="1874"/>
+            <w:shd w:fill="F2F2F2" w:val="clear"/>
           </w:tcPr>
           <w:p>
             <w:r>
@@ -9327,6 +9370,7 @@
         <w:tc>
           <w:tcPr>
             <w:tcW w:type="dxa" w:w="3928"/>
+            <w:shd w:fill="F2F2F2" w:val="clear"/>
           </w:tcPr>
           <w:p>
             <w:r>
@@ -9337,6 +9381,7 @@
         <w:tc>
           <w:tcPr>
             <w:tcW w:type="dxa" w:w="1815"/>
+            <w:shd w:fill="F2F2F2" w:val="clear"/>
           </w:tcPr>
           <w:p>
             <w:r>
@@ -9347,6 +9392,7 @@
         <w:tc>
           <w:tcPr>
             <w:tcW w:type="dxa" w:w="1873"/>
+            <w:shd w:fill="F2F2F2" w:val="clear"/>
           </w:tcPr>
           <w:p>
             <w:r/>
@@ -9355,6 +9401,7 @@
         <w:tc>
           <w:tcPr>
             <w:tcW w:type="dxa" w:w="1874"/>
+            <w:shd w:fill="F2F2F2" w:val="clear"/>
           </w:tcPr>
           <w:p>
             <w:r/>
@@ -9403,6 +9450,7 @@
         <w:tc>
           <w:tcPr>
             <w:tcW w:type="dxa" w:w="3928"/>
+            <w:shd w:fill="F2F2F2" w:val="clear"/>
           </w:tcPr>
           <w:p>
             <w:r>
@@ -9413,6 +9461,7 @@
         <w:tc>
           <w:tcPr>
             <w:tcW w:type="dxa" w:w="1815"/>
+            <w:shd w:fill="F2F2F2" w:val="clear"/>
           </w:tcPr>
           <w:p>
             <w:r/>
@@ -9421,6 +9470,7 @@
         <w:tc>
           <w:tcPr>
             <w:tcW w:type="dxa" w:w="1873"/>
+            <w:shd w:fill="F2F2F2" w:val="clear"/>
           </w:tcPr>
           <w:p>
             <w:r/>
@@ -9429,6 +9479,7 @@
         <w:tc>
           <w:tcPr>
             <w:tcW w:type="dxa" w:w="1874"/>
+            <w:shd w:fill="F2F2F2" w:val="clear"/>
           </w:tcPr>
           <w:p>
             <w:r>
@@ -9479,6 +9530,7 @@
         <w:tc>
           <w:tcPr>
             <w:tcW w:type="dxa" w:w="3928"/>
+            <w:shd w:fill="F2F2F2" w:val="clear"/>
           </w:tcPr>
           <w:p>
             <w:r>
@@ -9489,6 +9541,7 @@
         <w:tc>
           <w:tcPr>
             <w:tcW w:type="dxa" w:w="1815"/>
+            <w:shd w:fill="F2F2F2" w:val="clear"/>
           </w:tcPr>
           <w:p>
             <w:r>
@@ -9499,6 +9552,7 @@
         <w:tc>
           <w:tcPr>
             <w:tcW w:type="dxa" w:w="1873"/>
+            <w:shd w:fill="F2F2F2" w:val="clear"/>
           </w:tcPr>
           <w:p>
             <w:r/>
@@ -9507,6 +9561,7 @@
         <w:tc>
           <w:tcPr>
             <w:tcW w:type="dxa" w:w="1874"/>
+            <w:shd w:fill="F2F2F2" w:val="clear"/>
           </w:tcPr>
           <w:p>
             <w:r/>
@@ -9555,6 +9610,7 @@
         <w:tc>
           <w:tcPr>
             <w:tcW w:type="dxa" w:w="3928"/>
+            <w:shd w:fill="F2F2F2" w:val="clear"/>
           </w:tcPr>
           <w:p>
             <w:r>
@@ -9565,6 +9621,7 @@
         <w:tc>
           <w:tcPr>
             <w:tcW w:type="dxa" w:w="1815"/>
+            <w:shd w:fill="F2F2F2" w:val="clear"/>
           </w:tcPr>
           <w:p>
             <w:r/>
@@ -9573,6 +9630,7 @@
         <w:tc>
           <w:tcPr>
             <w:tcW w:type="dxa" w:w="1873"/>
+            <w:shd w:fill="F2F2F2" w:val="clear"/>
           </w:tcPr>
           <w:p>
             <w:r/>
@@ -9581,6 +9639,7 @@
         <w:tc>
           <w:tcPr>
             <w:tcW w:type="dxa" w:w="1874"/>
+            <w:shd w:fill="F2F2F2" w:val="clear"/>
           </w:tcPr>
           <w:p>
             <w:r>
@@ -9631,6 +9690,7 @@
         <w:tc>
           <w:tcPr>
             <w:tcW w:type="dxa" w:w="3928"/>
+            <w:shd w:fill="F2F2F2" w:val="clear"/>
           </w:tcPr>
           <w:p>
             <w:r>
@@ -9641,6 +9701,7 @@
         <w:tc>
           <w:tcPr>
             <w:tcW w:type="dxa" w:w="1815"/>
+            <w:shd w:fill="F2F2F2" w:val="clear"/>
           </w:tcPr>
           <w:p>
             <w:r>
@@ -9651,6 +9712,7 @@
         <w:tc>
           <w:tcPr>
             <w:tcW w:type="dxa" w:w="1873"/>
+            <w:shd w:fill="F2F2F2" w:val="clear"/>
           </w:tcPr>
           <w:p>
             <w:r/>
@@ -9659,6 +9721,7 @@
         <w:tc>
           <w:tcPr>
             <w:tcW w:type="dxa" w:w="1874"/>
+            <w:shd w:fill="F2F2F2" w:val="clear"/>
           </w:tcPr>
           <w:p>
             <w:r/>
@@ -9707,6 +9770,7 @@
         <w:tc>
           <w:tcPr>
             <w:tcW w:type="dxa" w:w="3928"/>
+            <w:shd w:fill="F2F2F2" w:val="clear"/>
           </w:tcPr>
           <w:p>
             <w:r>
@@ -9717,6 +9781,7 @@
         <w:tc>
           <w:tcPr>
             <w:tcW w:type="dxa" w:w="1815"/>
+            <w:shd w:fill="F2F2F2" w:val="clear"/>
           </w:tcPr>
           <w:p>
             <w:r>
@@ -9727,6 +9792,7 @@
         <w:tc>
           <w:tcPr>
             <w:tcW w:type="dxa" w:w="1873"/>
+            <w:shd w:fill="F2F2F2" w:val="clear"/>
           </w:tcPr>
           <w:p>
             <w:r/>
@@ -9735,6 +9801,7 @@
         <w:tc>
           <w:tcPr>
             <w:tcW w:type="dxa" w:w="1874"/>
+            <w:shd w:fill="F2F2F2" w:val="clear"/>
           </w:tcPr>
           <w:p>
             <w:r/>
@@ -9783,6 +9850,7 @@
         <w:tc>
           <w:tcPr>
             <w:tcW w:type="dxa" w:w="3928"/>
+            <w:shd w:fill="F2F2F2" w:val="clear"/>
           </w:tcPr>
           <w:p>
             <w:r>
@@ -9793,6 +9861,7 @@
         <w:tc>
           <w:tcPr>
             <w:tcW w:type="dxa" w:w="1815"/>
+            <w:shd w:fill="F2F2F2" w:val="clear"/>
           </w:tcPr>
           <w:p>
             <w:r/>
@@ -9801,6 +9870,7 @@
         <w:tc>
           <w:tcPr>
             <w:tcW w:type="dxa" w:w="1873"/>
+            <w:shd w:fill="F2F2F2" w:val="clear"/>
           </w:tcPr>
           <w:p>
             <w:r/>
@@ -9809,6 +9879,7 @@
         <w:tc>
           <w:tcPr>
             <w:tcW w:type="dxa" w:w="1874"/>
+            <w:shd w:fill="F2F2F2" w:val="clear"/>
           </w:tcPr>
           <w:p>
             <w:r>
@@ -9859,6 +9930,7 @@
         <w:tc>
           <w:tcPr>
             <w:tcW w:type="dxa" w:w="3928"/>
+            <w:shd w:fill="F2F2F2" w:val="clear"/>
           </w:tcPr>
           <w:p>
             <w:r>
@@ -9869,6 +9941,7 @@
         <w:tc>
           <w:tcPr>
             <w:tcW w:type="dxa" w:w="1815"/>
+            <w:shd w:fill="F2F2F2" w:val="clear"/>
           </w:tcPr>
           <w:p>
             <w:r/>
@@ -9877,6 +9950,7 @@
         <w:tc>
           <w:tcPr>
             <w:tcW w:type="dxa" w:w="1873"/>
+            <w:shd w:fill="F2F2F2" w:val="clear"/>
           </w:tcPr>
           <w:p>
             <w:r/>
@@ -9885,6 +9959,7 @@
         <w:tc>
           <w:tcPr>
             <w:tcW w:type="dxa" w:w="1874"/>
+            <w:shd w:fill="F2F2F2" w:val="clear"/>
           </w:tcPr>
           <w:p>
             <w:r>
@@ -9935,6 +10010,7 @@
         <w:tc>
           <w:tcPr>
             <w:tcW w:type="dxa" w:w="3928"/>
+            <w:shd w:fill="F2F2F2" w:val="clear"/>
           </w:tcPr>
           <w:p>
             <w:r>
@@ -9945,6 +10021,7 @@
         <w:tc>
           <w:tcPr>
             <w:tcW w:type="dxa" w:w="1815"/>
+            <w:shd w:fill="F2F2F2" w:val="clear"/>
           </w:tcPr>
           <w:p>
             <w:r/>
@@ -9953,6 +10030,7 @@
         <w:tc>
           <w:tcPr>
             <w:tcW w:type="dxa" w:w="1873"/>
+            <w:shd w:fill="F2F2F2" w:val="clear"/>
           </w:tcPr>
           <w:p>
             <w:r/>
@@ -9961,6 +10039,7 @@
         <w:tc>
           <w:tcPr>
             <w:tcW w:type="dxa" w:w="1874"/>
+            <w:shd w:fill="F2F2F2" w:val="clear"/>
           </w:tcPr>
           <w:p>
             <w:r>
@@ -10011,6 +10090,7 @@
         <w:tc>
           <w:tcPr>
             <w:tcW w:type="dxa" w:w="3928"/>
+            <w:shd w:fill="F2F2F2" w:val="clear"/>
           </w:tcPr>
           <w:p>
             <w:r>
@@ -10021,6 +10101,7 @@
         <w:tc>
           <w:tcPr>
             <w:tcW w:type="dxa" w:w="1815"/>
+            <w:shd w:fill="F2F2F2" w:val="clear"/>
           </w:tcPr>
           <w:p>
             <w:r/>
@@ -10029,6 +10110,7 @@
         <w:tc>
           <w:tcPr>
             <w:tcW w:type="dxa" w:w="1873"/>
+            <w:shd w:fill="F2F2F2" w:val="clear"/>
           </w:tcPr>
           <w:p>
             <w:r/>
@@ -10037,6 +10119,7 @@
         <w:tc>
           <w:tcPr>
             <w:tcW w:type="dxa" w:w="1874"/>
+            <w:shd w:fill="F2F2F2" w:val="clear"/>
           </w:tcPr>
           <w:p>
             <w:r>
@@ -10087,6 +10170,7 @@
         <w:tc>
           <w:tcPr>
             <w:tcW w:type="dxa" w:w="3928"/>
+            <w:shd w:fill="F2F2F2" w:val="clear"/>
           </w:tcPr>
           <w:p>
             <w:r>
@@ -10097,6 +10181,7 @@
         <w:tc>
           <w:tcPr>
             <w:tcW w:type="dxa" w:w="1815"/>
+            <w:shd w:fill="F2F2F2" w:val="clear"/>
           </w:tcPr>
           <w:p>
             <w:r/>
@@ -10105,6 +10190,7 @@
         <w:tc>
           <w:tcPr>
             <w:tcW w:type="dxa" w:w="1873"/>
+            <w:shd w:fill="F2F2F2" w:val="clear"/>
           </w:tcPr>
           <w:p>
             <w:r/>
@@ -10113,6 +10199,7 @@
         <w:tc>
           <w:tcPr>
             <w:tcW w:type="dxa" w:w="1874"/>
+            <w:shd w:fill="F2F2F2" w:val="clear"/>
           </w:tcPr>
           <w:p>
             <w:r>
@@ -10163,6 +10250,7 @@
         <w:tc>
           <w:tcPr>
             <w:tcW w:type="dxa" w:w="3928"/>
+            <w:shd w:fill="F2F2F2" w:val="clear"/>
           </w:tcPr>
           <w:p>
             <w:r>
@@ -10173,6 +10261,7 @@
         <w:tc>
           <w:tcPr>
             <w:tcW w:type="dxa" w:w="1815"/>
+            <w:shd w:fill="F2F2F2" w:val="clear"/>
           </w:tcPr>
           <w:p>
             <w:r>
@@ -10183,6 +10272,7 @@
         <w:tc>
           <w:tcPr>
             <w:tcW w:type="dxa" w:w="1873"/>
+            <w:shd w:fill="F2F2F2" w:val="clear"/>
           </w:tcPr>
           <w:p>
             <w:r/>
@@ -10191,6 +10281,7 @@
         <w:tc>
           <w:tcPr>
             <w:tcW w:type="dxa" w:w="1874"/>
+            <w:shd w:fill="F2F2F2" w:val="clear"/>
           </w:tcPr>
           <w:p>
             <w:r/>
@@ -10453,6 +10544,7 @@
         <w:tc>
           <w:tcPr>
             <w:tcW w:w="3115" w:type="dxa"/>
+            <w:shd w:fill="AEAAAA" w:val="clear"/>
           </w:tcPr>
           <w:p>
             <w:pPr>
@@ -10467,6 +10559,8 @@
             <w:r>
               <w:rPr>
                 <w:rFonts w:ascii="Times New Roman" w:hAnsi="Times New Roman" w:cs="Times New Roman"/>
+                <w:b/>
+                <w:color w:val="FFFFFF"/>
                 <w:sz w:val="24"/>
                 <w:szCs w:val="24"/>
                 <w:lang w:val="en-US"/>
@@ -10478,6 +10572,7 @@
         <w:tc>
           <w:tcPr>
             <w:tcW w:w="3115" w:type="dxa"/>
+            <w:shd w:fill="AEAAAA" w:val="clear"/>
           </w:tcPr>
           <w:p>
             <w:pPr>
@@ -10492,6 +10587,8 @@
             <w:r>
               <w:rPr>
                 <w:rFonts w:ascii="Times New Roman" w:hAnsi="Times New Roman" w:cs="Times New Roman"/>
+                <w:b/>
+                <w:color w:val="FFFFFF"/>
                 <w:sz w:val="24"/>
                 <w:szCs w:val="24"/>
                 <w:lang w:val="en-US"/>
@@ -10503,6 +10600,7 @@
         <w:tc>
           <w:tcPr>
             <w:tcW w:w="3115" w:type="dxa"/>
+            <w:shd w:fill="AEAAAA" w:val="clear"/>
           </w:tcPr>
           <w:p>
             <w:pPr>
@@ -10517,6 +10615,8 @@
             <w:r>
               <w:rPr>
                 <w:rFonts w:ascii="Times New Roman" w:hAnsi="Times New Roman" w:cs="Times New Roman"/>
+                <w:b/>
+                <w:color w:val="FFFFFF"/>
                 <w:sz w:val="24"/>
                 <w:szCs w:val="24"/>
                 <w:lang w:val="en-US"/>
@@ -10562,6 +10662,7 @@
         <w:tc>
           <w:tcPr>
             <w:tcW w:type="dxa" w:w="3164"/>
+            <w:shd w:fill="F2F2F2" w:val="clear"/>
           </w:tcPr>
           <w:p>
             <w:r>
@@ -10572,6 +10673,7 @@
         <w:tc>
           <w:tcPr>
             <w:tcW w:type="dxa" w:w="3163"/>
+            <w:shd w:fill="F2F2F2" w:val="clear"/>
           </w:tcPr>
           <w:p>
             <w:r>
@@ -10582,6 +10684,7 @@
         <w:tc>
           <w:tcPr>
             <w:tcW w:type="dxa" w:w="3163"/>
+            <w:shd w:fill="F2F2F2" w:val="clear"/>
           </w:tcPr>
           <w:p>
             <w:r>
@@ -10626,6 +10729,7 @@
         <w:tc>
           <w:tcPr>
             <w:tcW w:type="dxa" w:w="3164"/>
+            <w:shd w:fill="F2F2F2" w:val="clear"/>
           </w:tcPr>
           <w:p>
             <w:r>
@@ -10636,6 +10740,7 @@
         <w:tc>
           <w:tcPr>
             <w:tcW w:type="dxa" w:w="3163"/>
+            <w:shd w:fill="F2F2F2" w:val="clear"/>
           </w:tcPr>
           <w:p>
             <w:r>
@@ -10646,6 +10751,7 @@
         <w:tc>
           <w:tcPr>
             <w:tcW w:type="dxa" w:w="3163"/>
+            <w:shd w:fill="F2F2F2" w:val="clear"/>
           </w:tcPr>
           <w:p>
             <w:r>
@@ -10940,9 +11046,9 @@
               <w:bottom w:val="single" w:sz="8" w:space="0" w:color="BFBFBF"/>
               <w:right w:val="nil"/>
             </w:tcBorders>
-            <w:shd w:val="clear" w:color="auto" w:fill="auto"/>
             <w:vAlign w:val="center"/>
             <w:hideMark/>
+            <w:shd w:fill="AEAAAA" w:val="clear"/>
           </w:tcPr>
           <w:p>
             <w:pPr>
@@ -10960,6 +11066,7 @@
               <w:rPr>
                 <w:rFonts w:ascii="Times New Roman" w:eastAsia="Times New Roman" w:hAnsi="Times New Roman" w:cs="Times New Roman"/>
                 <w:b/>
+                <w:color w:val="FFFFFF"/>
                 <w:sz w:val="24"/>
                 <w:szCs w:val="24"/>
                 <w:lang w:val="en-US"/>
@@ -10989,10 +11096,10 @@
               <w:bottom w:val="single" w:sz="8" w:space="0" w:color="BFBFBF"/>
               <w:right w:val="single" w:sz="8" w:space="0" w:color="BFBFBF"/>
             </w:tcBorders>
-            <w:shd w:val="clear" w:color="auto" w:fill="D0CECE" w:themeFill="background2" w:themeFillShade="E6"/>
             <w:textDirection w:val="btLr"/>
             <w:vAlign w:val="bottom"/>
             <w:hideMark/>
+            <w:shd w:fill="AEAAAA" w:val="clear"/>
           </w:tcPr>
           <w:p>
             <w:pPr>
@@ -11010,6 +11117,7 @@
             <w:r>
               <w:rPr>
                 <w:rFonts w:ascii="Times New Roman" w:eastAsia="Times New Roman" w:hAnsi="Times New Roman" w:cs="Times New Roman"/>
+                <w:b/>
                 <w:color w:val="FFFFFF"/>
                 <w:sz w:val="24"/>
                 <w:szCs w:val="24"/>
@@ -11028,10 +11136,10 @@
               <w:bottom w:val="single" w:sz="8" w:space="0" w:color="BFBFBF"/>
               <w:right w:val="single" w:sz="8" w:space="0" w:color="BFBFBF"/>
             </w:tcBorders>
-            <w:shd w:val="clear" w:color="auto" w:fill="D0CECE" w:themeFill="background2" w:themeFillShade="E6"/>
             <w:textDirection w:val="btLr"/>
             <w:vAlign w:val="bottom"/>
             <w:hideMark/>
+            <w:shd w:fill="AEAAAA" w:val="clear"/>
           </w:tcPr>
           <w:p>
             <w:pPr>
@@ -11049,6 +11157,7 @@
             <w:r>
               <w:rPr>
                 <w:rFonts w:ascii="Times New Roman" w:eastAsia="Times New Roman" w:hAnsi="Times New Roman" w:cs="Times New Roman"/>
+                <w:b/>
                 <w:color w:val="FFFFFF"/>
                 <w:sz w:val="24"/>
                 <w:szCs w:val="24"/>
@@ -11067,10 +11176,10 @@
               <w:bottom w:val="single" w:sz="8" w:space="0" w:color="BFBFBF"/>
               <w:right w:val="single" w:sz="8" w:space="0" w:color="BFBFBF"/>
             </w:tcBorders>
-            <w:shd w:val="clear" w:color="auto" w:fill="D0CECE" w:themeFill="background2" w:themeFillShade="E6"/>
             <w:textDirection w:val="btLr"/>
             <w:vAlign w:val="bottom"/>
             <w:hideMark/>
+            <w:shd w:fill="AEAAAA" w:val="clear"/>
           </w:tcPr>
           <w:p>
             <w:pPr>
@@ -11088,6 +11197,7 @@
             <w:r>
               <w:rPr>
                 <w:rFonts w:ascii="Times New Roman" w:eastAsia="Times New Roman" w:hAnsi="Times New Roman" w:cs="Times New Roman"/>
+                <w:b/>
                 <w:color w:val="FFFFFF"/>
                 <w:sz w:val="24"/>
                 <w:szCs w:val="24"/>
@@ -11106,10 +11216,10 @@
               <w:bottom w:val="single" w:sz="8" w:space="0" w:color="BFBFBF"/>
               <w:right w:val="single" w:sz="12" w:space="0" w:color="808080"/>
             </w:tcBorders>
-            <w:shd w:val="clear" w:color="auto" w:fill="D0CECE" w:themeFill="background2" w:themeFillShade="E6"/>
             <w:textDirection w:val="btLr"/>
             <w:vAlign w:val="bottom"/>
             <w:hideMark/>
+            <w:shd w:fill="AEAAAA" w:val="clear"/>
           </w:tcPr>
           <w:p>
             <w:pPr>
@@ -11127,6 +11237,7 @@
             <w:r>
               <w:rPr>
                 <w:rFonts w:ascii="Times New Roman" w:eastAsia="Times New Roman" w:hAnsi="Times New Roman" w:cs="Times New Roman"/>
+                <w:b/>
                 <w:color w:val="FFFFFF"/>
                 <w:sz w:val="24"/>
                 <w:szCs w:val="24"/>
@@ -11145,10 +11256,10 @@
               <w:bottom w:val="single" w:sz="8" w:space="0" w:color="BFBFBF"/>
               <w:right w:val="single" w:sz="8" w:space="0" w:color="BFBFBF"/>
             </w:tcBorders>
-            <w:shd w:val="clear" w:color="auto" w:fill="D0CECE" w:themeFill="background2" w:themeFillShade="E6"/>
             <w:textDirection w:val="btLr"/>
             <w:vAlign w:val="bottom"/>
             <w:hideMark/>
+            <w:shd w:fill="AEAAAA" w:val="clear"/>
           </w:tcPr>
           <w:p>
             <w:pPr>
@@ -11166,6 +11277,7 @@
             <w:r>
               <w:rPr>
                 <w:rFonts w:ascii="Times New Roman" w:eastAsia="Times New Roman" w:hAnsi="Times New Roman" w:cs="Times New Roman"/>
+                <w:b/>
                 <w:color w:val="FFFFFF"/>
                 <w:sz w:val="24"/>
                 <w:szCs w:val="24"/>
@@ -11184,10 +11296,10 @@
               <w:bottom w:val="single" w:sz="8" w:space="0" w:color="BFBFBF"/>
               <w:right w:val="single" w:sz="8" w:space="0" w:color="BFBFBF"/>
             </w:tcBorders>
-            <w:shd w:val="clear" w:color="auto" w:fill="D0CECE" w:themeFill="background2" w:themeFillShade="E6"/>
             <w:textDirection w:val="btLr"/>
             <w:vAlign w:val="bottom"/>
             <w:hideMark/>
+            <w:shd w:fill="AEAAAA" w:val="clear"/>
           </w:tcPr>
           <w:p>
             <w:pPr>
@@ -11205,6 +11317,7 @@
             <w:r>
               <w:rPr>
                 <w:rFonts w:ascii="Times New Roman" w:eastAsia="Times New Roman" w:hAnsi="Times New Roman" w:cs="Times New Roman"/>
+                <w:b/>
                 <w:color w:val="FFFFFF"/>
                 <w:sz w:val="24"/>
                 <w:szCs w:val="24"/>
@@ -11223,10 +11336,10 @@
               <w:bottom w:val="single" w:sz="8" w:space="0" w:color="BFBFBF"/>
               <w:right w:val="single" w:sz="8" w:space="0" w:color="BFBFBF"/>
             </w:tcBorders>
-            <w:shd w:val="clear" w:color="auto" w:fill="D0CECE" w:themeFill="background2" w:themeFillShade="E6"/>
             <w:textDirection w:val="btLr"/>
             <w:vAlign w:val="bottom"/>
             <w:hideMark/>
+            <w:shd w:fill="AEAAAA" w:val="clear"/>
           </w:tcPr>
           <w:p>
             <w:pPr>
@@ -11244,6 +11357,7 @@
             <w:r>
               <w:rPr>
                 <w:rFonts w:ascii="Times New Roman" w:eastAsia="Times New Roman" w:hAnsi="Times New Roman" w:cs="Times New Roman"/>
+                <w:b/>
                 <w:color w:val="FFFFFF"/>
                 <w:sz w:val="24"/>
                 <w:szCs w:val="24"/>
@@ -11262,10 +11376,10 @@
               <w:bottom w:val="single" w:sz="8" w:space="0" w:color="BFBFBF"/>
               <w:right w:val="single" w:sz="12" w:space="0" w:color="808080"/>
             </w:tcBorders>
-            <w:shd w:val="clear" w:color="auto" w:fill="D0CECE" w:themeFill="background2" w:themeFillShade="E6"/>
             <w:textDirection w:val="btLr"/>
             <w:vAlign w:val="bottom"/>
             <w:hideMark/>
+            <w:shd w:fill="AEAAAA" w:val="clear"/>
           </w:tcPr>
           <w:p>
             <w:pPr>
@@ -11283,6 +11397,7 @@
             <w:r>
               <w:rPr>
                 <w:rFonts w:ascii="Times New Roman" w:eastAsia="Times New Roman" w:hAnsi="Times New Roman" w:cs="Times New Roman"/>
+                <w:b/>
                 <w:color w:val="FFFFFF"/>
                 <w:sz w:val="24"/>
                 <w:szCs w:val="24"/>
@@ -11301,10 +11416,10 @@
               <w:bottom w:val="single" w:sz="8" w:space="0" w:color="BFBFBF"/>
               <w:right w:val="single" w:sz="8" w:space="0" w:color="BFBFBF"/>
             </w:tcBorders>
-            <w:shd w:val="clear" w:color="auto" w:fill="D0CECE" w:themeFill="background2" w:themeFillShade="E6"/>
             <w:textDirection w:val="btLr"/>
             <w:vAlign w:val="bottom"/>
             <w:hideMark/>
+            <w:shd w:fill="AEAAAA" w:val="clear"/>
           </w:tcPr>
           <w:p>
             <w:pPr>
@@ -11322,6 +11437,7 @@
             <w:r>
               <w:rPr>
                 <w:rFonts w:ascii="Times New Roman" w:eastAsia="Times New Roman" w:hAnsi="Times New Roman" w:cs="Times New Roman"/>
+                <w:b/>
                 <w:color w:val="FFFFFF"/>
                 <w:sz w:val="24"/>
                 <w:szCs w:val="24"/>
@@ -11340,10 +11456,10 @@
               <w:bottom w:val="single" w:sz="8" w:space="0" w:color="BFBFBF"/>
               <w:right w:val="single" w:sz="8" w:space="0" w:color="BFBFBF"/>
             </w:tcBorders>
-            <w:shd w:val="clear" w:color="auto" w:fill="D0CECE" w:themeFill="background2" w:themeFillShade="E6"/>
             <w:textDirection w:val="btLr"/>
             <w:vAlign w:val="bottom"/>
             <w:hideMark/>
+            <w:shd w:fill="AEAAAA" w:val="clear"/>
           </w:tcPr>
           <w:p>
             <w:pPr>
@@ -11361,6 +11477,7 @@
             <w:r>
               <w:rPr>
                 <w:rFonts w:ascii="Times New Roman" w:eastAsia="Times New Roman" w:hAnsi="Times New Roman" w:cs="Times New Roman"/>
+                <w:b/>
                 <w:color w:val="FFFFFF"/>
                 <w:sz w:val="24"/>
                 <w:szCs w:val="24"/>
@@ -11379,10 +11496,10 @@
               <w:bottom w:val="single" w:sz="8" w:space="0" w:color="BFBFBF"/>
               <w:right w:val="single" w:sz="8" w:space="0" w:color="BFBFBF"/>
             </w:tcBorders>
-            <w:shd w:val="clear" w:color="auto" w:fill="D0CECE" w:themeFill="background2" w:themeFillShade="E6"/>
             <w:textDirection w:val="btLr"/>
             <w:vAlign w:val="bottom"/>
             <w:hideMark/>
+            <w:shd w:fill="AEAAAA" w:val="clear"/>
           </w:tcPr>
           <w:p>
             <w:pPr>
@@ -11400,6 +11517,7 @@
             <w:r>
               <w:rPr>
                 <w:rFonts w:ascii="Times New Roman" w:eastAsia="Times New Roman" w:hAnsi="Times New Roman" w:cs="Times New Roman"/>
+                <w:b/>
                 <w:color w:val="FFFFFF"/>
                 <w:sz w:val="24"/>
                 <w:szCs w:val="24"/>
@@ -11418,10 +11536,10 @@
               <w:bottom w:val="single" w:sz="8" w:space="0" w:color="BFBFBF"/>
               <w:right w:val="single" w:sz="12" w:space="0" w:color="808080"/>
             </w:tcBorders>
-            <w:shd w:val="clear" w:color="auto" w:fill="D0CECE" w:themeFill="background2" w:themeFillShade="E6"/>
             <w:textDirection w:val="btLr"/>
             <w:vAlign w:val="bottom"/>
             <w:hideMark/>
+            <w:shd w:fill="AEAAAA" w:val="clear"/>
           </w:tcPr>
           <w:p>
             <w:pPr>
@@ -11439,6 +11557,7 @@
             <w:r>
               <w:rPr>
                 <w:rFonts w:ascii="Times New Roman" w:eastAsia="Times New Roman" w:hAnsi="Times New Roman" w:cs="Times New Roman"/>
+                <w:b/>
                 <w:color w:val="FFFFFF"/>
                 <w:sz w:val="24"/>
                 <w:szCs w:val="24"/>
@@ -11457,10 +11576,10 @@
               <w:bottom w:val="single" w:sz="8" w:space="0" w:color="BFBFBF"/>
               <w:right w:val="single" w:sz="8" w:space="0" w:color="BFBFBF"/>
             </w:tcBorders>
-            <w:shd w:val="clear" w:color="auto" w:fill="D0CECE" w:themeFill="background2" w:themeFillShade="E6"/>
             <w:textDirection w:val="btLr"/>
             <w:vAlign w:val="bottom"/>
             <w:hideMark/>
+            <w:shd w:fill="AEAAAA" w:val="clear"/>
           </w:tcPr>
           <w:p>
             <w:pPr>
@@ -11478,6 +11597,7 @@
             <w:r>
               <w:rPr>
                 <w:rFonts w:ascii="Times New Roman" w:eastAsia="Times New Roman" w:hAnsi="Times New Roman" w:cs="Times New Roman"/>
+                <w:b/>
                 <w:color w:val="FFFFFF"/>
                 <w:sz w:val="24"/>
                 <w:szCs w:val="24"/>
@@ -11496,10 +11616,10 @@
               <w:bottom w:val="single" w:sz="8" w:space="0" w:color="BFBFBF"/>
               <w:right w:val="single" w:sz="8" w:space="0" w:color="BFBFBF"/>
             </w:tcBorders>
-            <w:shd w:val="clear" w:color="auto" w:fill="D0CECE" w:themeFill="background2" w:themeFillShade="E6"/>
             <w:textDirection w:val="btLr"/>
             <w:vAlign w:val="bottom"/>
             <w:hideMark/>
+            <w:shd w:fill="AEAAAA" w:val="clear"/>
           </w:tcPr>
           <w:p>
             <w:pPr>
@@ -11517,6 +11637,7 @@
             <w:r>
               <w:rPr>
                 <w:rFonts w:ascii="Times New Roman" w:eastAsia="Times New Roman" w:hAnsi="Times New Roman" w:cs="Times New Roman"/>
+                <w:b/>
                 <w:color w:val="FFFFFF"/>
                 <w:sz w:val="24"/>
                 <w:szCs w:val="24"/>
@@ -11535,10 +11656,10 @@
               <w:bottom w:val="single" w:sz="8" w:space="0" w:color="BFBFBF"/>
               <w:right w:val="single" w:sz="8" w:space="0" w:color="BFBFBF"/>
             </w:tcBorders>
-            <w:shd w:val="clear" w:color="auto" w:fill="D0CECE" w:themeFill="background2" w:themeFillShade="E6"/>
             <w:textDirection w:val="btLr"/>
             <w:vAlign w:val="bottom"/>
             <w:hideMark/>
+            <w:shd w:fill="AEAAAA" w:val="clear"/>
           </w:tcPr>
           <w:p>
             <w:pPr>
@@ -11556,6 +11677,7 @@
             <w:r>
               <w:rPr>
                 <w:rFonts w:ascii="Times New Roman" w:eastAsia="Times New Roman" w:hAnsi="Times New Roman" w:cs="Times New Roman"/>
+                <w:b/>
                 <w:color w:val="FFFFFF"/>
                 <w:sz w:val="24"/>
                 <w:szCs w:val="24"/>
@@ -11574,10 +11696,10 @@
               <w:bottom w:val="single" w:sz="8" w:space="0" w:color="BFBFBF"/>
               <w:right w:val="single" w:sz="12" w:space="0" w:color="808080"/>
             </w:tcBorders>
-            <w:shd w:val="clear" w:color="auto" w:fill="D0CECE" w:themeFill="background2" w:themeFillShade="E6"/>
             <w:textDirection w:val="btLr"/>
             <w:vAlign w:val="bottom"/>
             <w:hideMark/>
+            <w:shd w:fill="AEAAAA" w:val="clear"/>
           </w:tcPr>
           <w:p>
             <w:pPr>
@@ -11595,6 +11717,7 @@
             <w:r>
               <w:rPr>
                 <w:rFonts w:ascii="Times New Roman" w:eastAsia="Times New Roman" w:hAnsi="Times New Roman" w:cs="Times New Roman"/>
+                <w:b/>
                 <w:color w:val="FFFFFF"/>
                 <w:sz w:val="24"/>
                 <w:szCs w:val="24"/>
@@ -11619,9 +11742,9 @@
               <w:bottom w:val="single" w:sz="8" w:space="0" w:color="BFBFBF"/>
               <w:right w:val="nil"/>
             </w:tcBorders>
-            <w:shd w:val="clear" w:color="auto" w:fill="E7E6E6" w:themeFill="background2"/>
             <w:vAlign w:val="center"/>
             <w:hideMark/>
+            <w:shd w:fill="D9D9D9" w:val="clear"/>
           </w:tcPr>
           <w:p>
             <w:pPr>
@@ -11641,6 +11764,7 @@
                 <w:rFonts w:ascii="Times New Roman" w:eastAsia="Times New Roman" w:hAnsi="Times New Roman" w:cs="Times New Roman"/>
                 <w:b/>
                 <w:bCs/>
+                <w:color w:val="000000"/>
                 <w:sz w:val="24"/>
                 <w:szCs w:val="24"/>
                 <w:lang w:val="en-US"/>
@@ -11652,6 +11776,7 @@
                 <w:rFonts w:ascii="Times New Roman" w:eastAsia="Times New Roman" w:hAnsi="Times New Roman" w:cs="Times New Roman"/>
                 <w:b/>
                 <w:bCs/>
+                <w:color w:val="000000"/>
                 <w:sz w:val="24"/>
                 <w:szCs w:val="24"/>
                 <w:lang w:val="en-US"/>
@@ -11662,6 +11787,7 @@
                 <w:rFonts w:ascii="Times New Roman" w:eastAsia="Times New Roman" w:hAnsi="Times New Roman" w:cs="Times New Roman"/>
                 <w:b/>
                 <w:bCs/>
+                <w:color w:val="000000"/>
                 <w:sz w:val="24"/>
                 <w:szCs w:val="24"/>
                 <w:lang w:val="en-US"/>
@@ -11679,9 +11805,9 @@
               <w:bottom w:val="single" w:sz="8" w:space="0" w:color="BFBFBF"/>
               <w:right w:val="single" w:sz="12" w:space="0" w:color="808080"/>
             </w:tcBorders>
-            <w:shd w:val="clear" w:color="auto" w:fill="E7E6E6" w:themeFill="background2"/>
             <w:vAlign w:val="center"/>
             <w:hideMark/>
+            <w:shd w:fill="D9D9D9" w:val="clear"/>
           </w:tcPr>
           <w:p>
             <w:pPr>
@@ -11701,6 +11827,7 @@
                 <w:rFonts w:ascii="Times New Roman" w:eastAsia="Times New Roman" w:hAnsi="Times New Roman" w:cs="Times New Roman"/>
                 <w:b/>
                 <w:bCs/>
+                <w:color w:val="000000"/>
                 <w:sz w:val="24"/>
                 <w:szCs w:val="24"/>
                 <w:lang w:val="en-US"/>
@@ -11719,9 +11846,9 @@
               <w:bottom w:val="single" w:sz="8" w:space="0" w:color="BFBFBF"/>
               <w:right w:val="single" w:sz="12" w:space="0" w:color="808080"/>
             </w:tcBorders>
-            <w:shd w:val="clear" w:color="auto" w:fill="E7E6E6" w:themeFill="background2"/>
             <w:vAlign w:val="center"/>
             <w:hideMark/>
+            <w:shd w:fill="D9D9D9" w:val="clear"/>
           </w:tcPr>
           <w:p>
             <w:pPr>
@@ -11741,6 +11868,7 @@
                 <w:rFonts w:ascii="Times New Roman" w:eastAsia="Times New Roman" w:hAnsi="Times New Roman" w:cs="Times New Roman"/>
                 <w:b/>
                 <w:bCs/>
+                <w:color w:val="000000"/>
                 <w:sz w:val="24"/>
                 <w:szCs w:val="24"/>
                 <w:lang w:val="en-US"/>
@@ -11759,9 +11887,9 @@
               <w:bottom w:val="single" w:sz="8" w:space="0" w:color="BFBFBF"/>
               <w:right w:val="single" w:sz="12" w:space="0" w:color="808080"/>
             </w:tcBorders>
-            <w:shd w:val="clear" w:color="auto" w:fill="E7E6E6" w:themeFill="background2"/>
             <w:vAlign w:val="center"/>
             <w:hideMark/>
+            <w:shd w:fill="D9D9D9" w:val="clear"/>
           </w:tcPr>
           <w:p>
             <w:pPr>
@@ -11781,6 +11909,7 @@
                 <w:rFonts w:ascii="Times New Roman" w:eastAsia="Times New Roman" w:hAnsi="Times New Roman" w:cs="Times New Roman"/>
                 <w:b/>
                 <w:bCs/>
+                <w:color w:val="000000"/>
                 <w:sz w:val="24"/>
                 <w:szCs w:val="24"/>
                 <w:lang w:val="en-US"/>
@@ -11799,9 +11928,9 @@
               <w:bottom w:val="single" w:sz="8" w:space="0" w:color="BFBFBF"/>
               <w:right w:val="single" w:sz="12" w:space="0" w:color="808080"/>
             </w:tcBorders>
-            <w:shd w:val="clear" w:color="auto" w:fill="E7E6E6" w:themeFill="background2"/>
             <w:vAlign w:val="center"/>
             <w:hideMark/>
+            <w:shd w:fill="D9D9D9" w:val="clear"/>
           </w:tcPr>
           <w:p>
             <w:pPr>
@@ -11821,6 +11950,7 @@
                 <w:rFonts w:ascii="Times New Roman" w:eastAsia="Times New Roman" w:hAnsi="Times New Roman" w:cs="Times New Roman"/>
                 <w:b/>
                 <w:bCs/>
+                <w:color w:val="000000"/>
                 <w:sz w:val="24"/>
                 <w:szCs w:val="24"/>
                 <w:lang w:val="en-US"/>
@@ -11836,6 +11966,7 @@
         <w:tc>
           <w:tcPr>
             <w:tcW w:type="dxa" w:w="1348"/>
+            <w:shd w:fill="F2F2F2" w:val="clear"/>
           </w:tcPr>
           <w:p>
             <w:r>
@@ -11846,6 +11977,7 @@
         <w:tc>
           <w:tcPr>
             <w:tcW w:type="dxa" w:w="656"/>
+            <w:shd w:fill="F2F2F2" w:val="clear"/>
           </w:tcPr>
           <w:p>
             <w:r>
@@ -11856,6 +11988,7 @@
         <w:tc>
           <w:tcPr>
             <w:tcW w:type="dxa" w:w="450"/>
+            <w:shd w:fill="F2F2F2" w:val="clear"/>
           </w:tcPr>
           <w:p>
             <w:r>
@@ -11866,6 +11999,7 @@
         <w:tc>
           <w:tcPr>
             <w:tcW w:type="dxa" w:w="450"/>
+            <w:shd w:fill="F2F2F2" w:val="clear"/>
           </w:tcPr>
           <w:p>
             <w:r>
@@ -11876,6 +12010,7 @@
         <w:tc>
           <w:tcPr>
             <w:tcW w:type="dxa" w:w="1432"/>
+            <w:shd w:fill="F2F2F2" w:val="clear"/>
           </w:tcPr>
           <w:p>
             <w:r>
@@ -11886,6 +12021,7 @@
         <w:tc>
           <w:tcPr>
             <w:tcW w:type="dxa" w:w="452"/>
+            <w:shd w:fill="F2F2F2" w:val="clear"/>
           </w:tcPr>
           <w:p>
             <w:r>
@@ -11896,6 +12032,7 @@
         <w:tc>
           <w:tcPr>
             <w:tcW w:type="dxa" w:w="362"/>
+            <w:shd w:fill="F2F2F2" w:val="clear"/>
           </w:tcPr>
           <w:p>
             <w:r>
@@ -11906,6 +12043,7 @@
         <w:tc>
           <w:tcPr>
             <w:tcW w:type="dxa" w:w="452"/>
+            <w:shd w:fill="F2F2F2" w:val="clear"/>
           </w:tcPr>
           <w:p>
             <w:r>
@@ -11916,6 +12054,7 @@
         <w:tc>
           <w:tcPr>
             <w:tcW w:type="dxa" w:w="452"/>
+            <w:shd w:fill="F2F2F2" w:val="clear"/>
           </w:tcPr>
           <w:p>
             <w:r/>
@@ -11924,6 +12063,7 @@
         <w:tc>
           <w:tcPr>
             <w:tcW w:type="dxa" w:w="362"/>
+            <w:shd w:fill="F2F2F2" w:val="clear"/>
           </w:tcPr>
           <w:p>
             <w:r>
@@ -11934,6 +12074,7 @@
         <w:tc>
           <w:tcPr>
             <w:tcW w:type="dxa" w:w="452"/>
+            <w:shd w:fill="F2F2F2" w:val="clear"/>
           </w:tcPr>
           <w:p>
             <w:r>
@@ -11944,6 +12085,7 @@
         <w:tc>
           <w:tcPr>
             <w:tcW w:type="dxa" w:w="452"/>
+            <w:shd w:fill="F2F2F2" w:val="clear"/>
           </w:tcPr>
           <w:p>
             <w:r>
@@ -11954,6 +12096,7 @@
         <w:tc>
           <w:tcPr>
             <w:tcW w:type="dxa" w:w="452"/>
+            <w:shd w:fill="F2F2F2" w:val="clear"/>
           </w:tcPr>
           <w:p>
             <w:r/>
@@ -11962,6 +12105,7 @@
         <w:tc>
           <w:tcPr>
             <w:tcW w:type="dxa" w:w="452"/>
+            <w:shd w:fill="F2F2F2" w:val="clear"/>
           </w:tcPr>
           <w:p>
             <w:r>
@@ -11972,6 +12116,7 @@
         <w:tc>
           <w:tcPr>
             <w:tcW w:type="dxa" w:w="362"/>
+            <w:shd w:fill="F2F2F2" w:val="clear"/>
           </w:tcPr>
           <w:p>
             <w:r/>
@@ -11980,6 +12125,7 @@
         <w:tc>
           <w:tcPr>
             <w:tcW w:type="dxa" w:w="452"/>
+            <w:shd w:fill="F2F2F2" w:val="clear"/>
           </w:tcPr>
           <w:p>
             <w:r/>
@@ -11988,6 +12134,7 @@
         <w:tc>
           <w:tcPr>
             <w:tcW w:type="dxa" w:w="452"/>
+            <w:shd w:fill="F2F2F2" w:val="clear"/>
           </w:tcPr>
           <w:p>
             <w:r/>
@@ -12160,6 +12307,7 @@
         <w:tc>
           <w:tcPr>
             <w:tcW w:type="dxa" w:w="1348"/>
+            <w:shd w:fill="F2F2F2" w:val="clear"/>
           </w:tcPr>
           <w:p>
             <w:r>
@@ -12170,6 +12318,7 @@
         <w:tc>
           <w:tcPr>
             <w:tcW w:type="dxa" w:w="656"/>
+            <w:shd w:fill="F2F2F2" w:val="clear"/>
           </w:tcPr>
           <w:p>
             <w:r>
@@ -12180,6 +12329,7 @@
         <w:tc>
           <w:tcPr>
             <w:tcW w:type="dxa" w:w="450"/>
+            <w:shd w:fill="F2F2F2" w:val="clear"/>
           </w:tcPr>
           <w:p>
             <w:r>
@@ -12190,6 +12340,7 @@
         <w:tc>
           <w:tcPr>
             <w:tcW w:type="dxa" w:w="450"/>
+            <w:shd w:fill="F2F2F2" w:val="clear"/>
           </w:tcPr>
           <w:p>
             <w:r>
@@ -12200,6 +12351,7 @@
         <w:tc>
           <w:tcPr>
             <w:tcW w:type="dxa" w:w="1432"/>
+            <w:shd w:fill="F2F2F2" w:val="clear"/>
           </w:tcPr>
           <w:p>
             <w:r>
@@ -12210,6 +12362,7 @@
         <w:tc>
           <w:tcPr>
             <w:tcW w:type="dxa" w:w="452"/>
+            <w:shd w:fill="F2F2F2" w:val="clear"/>
           </w:tcPr>
           <w:p>
             <w:r>
@@ -12220,6 +12373,7 @@
         <w:tc>
           <w:tcPr>
             <w:tcW w:type="dxa" w:w="362"/>
+            <w:shd w:fill="F2F2F2" w:val="clear"/>
           </w:tcPr>
           <w:p>
             <w:r>
@@ -12230,6 +12384,7 @@
         <w:tc>
           <w:tcPr>
             <w:tcW w:type="dxa" w:w="452"/>
+            <w:shd w:fill="F2F2F2" w:val="clear"/>
           </w:tcPr>
           <w:p>
             <w:r>
@@ -12240,6 +12395,7 @@
         <w:tc>
           <w:tcPr>
             <w:tcW w:type="dxa" w:w="452"/>
+            <w:shd w:fill="F2F2F2" w:val="clear"/>
           </w:tcPr>
           <w:p>
             <w:r>
@@ -12250,6 +12406,7 @@
         <w:tc>
           <w:tcPr>
             <w:tcW w:type="dxa" w:w="362"/>
+            <w:shd w:fill="F2F2F2" w:val="clear"/>
           </w:tcPr>
           <w:p>
             <w:r>
@@ -12260,6 +12417,7 @@
         <w:tc>
           <w:tcPr>
             <w:tcW w:type="dxa" w:w="452"/>
+            <w:shd w:fill="F2F2F2" w:val="clear"/>
           </w:tcPr>
           <w:p>
             <w:r>
@@ -12270,6 +12428,7 @@
         <w:tc>
           <w:tcPr>
             <w:tcW w:type="dxa" w:w="452"/>
+            <w:shd w:fill="F2F2F2" w:val="clear"/>
           </w:tcPr>
           <w:p>
             <w:r>
@@ -12280,6 +12439,7 @@
         <w:tc>
           <w:tcPr>
             <w:tcW w:type="dxa" w:w="452"/>
+            <w:shd w:fill="F2F2F2" w:val="clear"/>
           </w:tcPr>
           <w:p>
             <w:r/>
@@ -12288,6 +12448,7 @@
         <w:tc>
           <w:tcPr>
             <w:tcW w:type="dxa" w:w="452"/>
+            <w:shd w:fill="F2F2F2" w:val="clear"/>
           </w:tcPr>
           <w:p>
             <w:r>
@@ -12298,6 +12459,7 @@
         <w:tc>
           <w:tcPr>
             <w:tcW w:type="dxa" w:w="362"/>
+            <w:shd w:fill="F2F2F2" w:val="clear"/>
           </w:tcPr>
           <w:p>
             <w:r/>
@@ -12306,6 +12468,7 @@
         <w:tc>
           <w:tcPr>
             <w:tcW w:type="dxa" w:w="452"/>
+            <w:shd w:fill="F2F2F2" w:val="clear"/>
           </w:tcPr>
           <w:p>
             <w:r/>
@@ -12314,6 +12477,7 @@
         <w:tc>
           <w:tcPr>
             <w:tcW w:type="dxa" w:w="452"/>
+            <w:shd w:fill="F2F2F2" w:val="clear"/>
           </w:tcPr>
           <w:p>
             <w:r/>
@@ -12482,6 +12646,7 @@
         <w:tc>
           <w:tcPr>
             <w:tcW w:type="dxa" w:w="1348"/>
+            <w:shd w:fill="F2F2F2" w:val="clear"/>
           </w:tcPr>
           <w:p>
             <w:r>
@@ -12492,6 +12657,7 @@
         <w:tc>
           <w:tcPr>
             <w:tcW w:type="dxa" w:w="656"/>
+            <w:shd w:fill="F2F2F2" w:val="clear"/>
           </w:tcPr>
           <w:p>
             <w:r>
@@ -12502,6 +12668,7 @@
         <w:tc>
           <w:tcPr>
             <w:tcW w:type="dxa" w:w="450"/>
+            <w:shd w:fill="F2F2F2" w:val="clear"/>
           </w:tcPr>
           <w:p>
             <w:r>
@@ -12512,6 +12679,7 @@
         <w:tc>
           <w:tcPr>
             <w:tcW w:type="dxa" w:w="450"/>
+            <w:shd w:fill="F2F2F2" w:val="clear"/>
           </w:tcPr>
           <w:p>
             <w:r>
@@ -12522,6 +12690,7 @@
         <w:tc>
           <w:tcPr>
             <w:tcW w:type="dxa" w:w="1432"/>
+            <w:shd w:fill="F2F2F2" w:val="clear"/>
           </w:tcPr>
           <w:p>
             <w:r>
@@ -12532,6 +12701,7 @@
         <w:tc>
           <w:tcPr>
             <w:tcW w:type="dxa" w:w="452"/>
+            <w:shd w:fill="F2F2F2" w:val="clear"/>
           </w:tcPr>
           <w:p>
             <w:r>
@@ -12542,6 +12712,7 @@
         <w:tc>
           <w:tcPr>
             <w:tcW w:type="dxa" w:w="362"/>
+            <w:shd w:fill="F2F2F2" w:val="clear"/>
           </w:tcPr>
           <w:p>
             <w:r>
@@ -12552,6 +12723,7 @@
         <w:tc>
           <w:tcPr>
             <w:tcW w:type="dxa" w:w="452"/>
+            <w:shd w:fill="F2F2F2" w:val="clear"/>
           </w:tcPr>
           <w:p>
             <w:r>
@@ -12562,6 +12734,7 @@
         <w:tc>
           <w:tcPr>
             <w:tcW w:type="dxa" w:w="452"/>
+            <w:shd w:fill="F2F2F2" w:val="clear"/>
           </w:tcPr>
           <w:p>
             <w:r/>
@@ -12570,6 +12743,7 @@
         <w:tc>
           <w:tcPr>
             <w:tcW w:type="dxa" w:w="362"/>
+            <w:shd w:fill="F2F2F2" w:val="clear"/>
           </w:tcPr>
           <w:p>
             <w:r>
@@ -12580,6 +12754,7 @@
         <w:tc>
           <w:tcPr>
             <w:tcW w:type="dxa" w:w="452"/>
+            <w:shd w:fill="F2F2F2" w:val="clear"/>
           </w:tcPr>
           <w:p>
             <w:r>
@@ -12590,6 +12765,7 @@
         <w:tc>
           <w:tcPr>
             <w:tcW w:type="dxa" w:w="452"/>
+            <w:shd w:fill="F2F2F2" w:val="clear"/>
           </w:tcPr>
           <w:p>
             <w:r>
@@ -12600,6 +12776,7 @@
         <w:tc>
           <w:tcPr>
             <w:tcW w:type="dxa" w:w="452"/>
+            <w:shd w:fill="F2F2F2" w:val="clear"/>
           </w:tcPr>
           <w:p>
             <w:r/>
@@ -12608,6 +12785,7 @@
         <w:tc>
           <w:tcPr>
             <w:tcW w:type="dxa" w:w="452"/>
+            <w:shd w:fill="F2F2F2" w:val="clear"/>
           </w:tcPr>
           <w:p>
             <w:r>
@@ -12618,6 +12796,7 @@
         <w:tc>
           <w:tcPr>
             <w:tcW w:type="dxa" w:w="362"/>
+            <w:shd w:fill="F2F2F2" w:val="clear"/>
           </w:tcPr>
           <w:p>
             <w:r/>
@@ -12626,6 +12805,7 @@
         <w:tc>
           <w:tcPr>
             <w:tcW w:type="dxa" w:w="452"/>
+            <w:shd w:fill="F2F2F2" w:val="clear"/>
           </w:tcPr>
           <w:p>
             <w:r/>
@@ -12634,6 +12814,7 @@
         <w:tc>
           <w:tcPr>
             <w:tcW w:type="dxa" w:w="452"/>
+            <w:shd w:fill="F2F2F2" w:val="clear"/>
           </w:tcPr>
           <w:p>
             <w:r/>
@@ -12810,6 +12991,7 @@
         <w:tc>
           <w:tcPr>
             <w:tcW w:type="dxa" w:w="1348"/>
+            <w:shd w:fill="F2F2F2" w:val="clear"/>
           </w:tcPr>
           <w:p>
             <w:r>
@@ -12820,6 +13002,7 @@
         <w:tc>
           <w:tcPr>
             <w:tcW w:type="dxa" w:w="656"/>
+            <w:shd w:fill="F2F2F2" w:val="clear"/>
           </w:tcPr>
           <w:p>
             <w:r>
@@ -12830,6 +13013,7 @@
         <w:tc>
           <w:tcPr>
             <w:tcW w:type="dxa" w:w="450"/>
+            <w:shd w:fill="F2F2F2" w:val="clear"/>
           </w:tcPr>
           <w:p>
             <w:r>
@@ -12840,6 +13024,7 @@
         <w:tc>
           <w:tcPr>
             <w:tcW w:type="dxa" w:w="450"/>
+            <w:shd w:fill="F2F2F2" w:val="clear"/>
           </w:tcPr>
           <w:p>
             <w:r>
@@ -12850,6 +13035,7 @@
         <w:tc>
           <w:tcPr>
             <w:tcW w:type="dxa" w:w="1432"/>
+            <w:shd w:fill="F2F2F2" w:val="clear"/>
           </w:tcPr>
           <w:p>
             <w:r>
@@ -12860,6 +13046,7 @@
         <w:tc>
           <w:tcPr>
             <w:tcW w:type="dxa" w:w="452"/>
+            <w:shd w:fill="F2F2F2" w:val="clear"/>
           </w:tcPr>
           <w:p>
             <w:r>
@@ -12870,6 +13057,7 @@
         <w:tc>
           <w:tcPr>
             <w:tcW w:type="dxa" w:w="362"/>
+            <w:shd w:fill="F2F2F2" w:val="clear"/>
           </w:tcPr>
           <w:p>
             <w:r>
@@ -12880,6 +13068,7 @@
         <w:tc>
           <w:tcPr>
             <w:tcW w:type="dxa" w:w="452"/>
+            <w:shd w:fill="F2F2F2" w:val="clear"/>
           </w:tcPr>
           <w:p>
             <w:r>
@@ -12890,6 +13079,7 @@
         <w:tc>
           <w:tcPr>
             <w:tcW w:type="dxa" w:w="452"/>
+            <w:shd w:fill="F2F2F2" w:val="clear"/>
           </w:tcPr>
           <w:p>
             <w:r>
@@ -12900,6 +13090,7 @@
         <w:tc>
           <w:tcPr>
             <w:tcW w:type="dxa" w:w="362"/>
+            <w:shd w:fill="F2F2F2" w:val="clear"/>
           </w:tcPr>
           <w:p>
             <w:r>
@@ -12910,6 +13101,7 @@
         <w:tc>
           <w:tcPr>
             <w:tcW w:type="dxa" w:w="452"/>
+            <w:shd w:fill="F2F2F2" w:val="clear"/>
           </w:tcPr>
           <w:p>
             <w:r>
@@ -12920,6 +13112,7 @@
         <w:tc>
           <w:tcPr>
             <w:tcW w:type="dxa" w:w="452"/>
+            <w:shd w:fill="F2F2F2" w:val="clear"/>
           </w:tcPr>
           <w:p>
             <w:r>
@@ -12930,6 +13123,7 @@
         <w:tc>
           <w:tcPr>
             <w:tcW w:type="dxa" w:w="452"/>
+            <w:shd w:fill="F2F2F2" w:val="clear"/>
           </w:tcPr>
           <w:p>
             <w:r/>
@@ -12938,6 +13132,7 @@
         <w:tc>
           <w:tcPr>
             <w:tcW w:type="dxa" w:w="452"/>
+            <w:shd w:fill="F2F2F2" w:val="clear"/>
           </w:tcPr>
           <w:p>
             <w:r>
@@ -12948,6 +13143,7 @@
         <w:tc>
           <w:tcPr>
             <w:tcW w:type="dxa" w:w="362"/>
+            <w:shd w:fill="F2F2F2" w:val="clear"/>
           </w:tcPr>
           <w:p>
             <w:r/>
@@ -12956,6 +13152,7 @@
         <w:tc>
           <w:tcPr>
             <w:tcW w:type="dxa" w:w="452"/>
+            <w:shd w:fill="F2F2F2" w:val="clear"/>
           </w:tcPr>
           <w:p>
             <w:r/>
@@ -12964,6 +13161,7 @@
         <w:tc>
           <w:tcPr>
             <w:tcW w:type="dxa" w:w="452"/>
+            <w:shd w:fill="F2F2F2" w:val="clear"/>
           </w:tcPr>
           <w:p>
             <w:r/>
@@ -13132,6 +13330,7 @@
         <w:tc>
           <w:tcPr>
             <w:tcW w:type="dxa" w:w="1348"/>
+            <w:shd w:fill="F2F2F2" w:val="clear"/>
           </w:tcPr>
           <w:p>
             <w:r>
@@ -13142,6 +13341,7 @@
         <w:tc>
           <w:tcPr>
             <w:tcW w:type="dxa" w:w="656"/>
+            <w:shd w:fill="F2F2F2" w:val="clear"/>
           </w:tcPr>
           <w:p>
             <w:r>
@@ -13152,6 +13352,7 @@
         <w:tc>
           <w:tcPr>
             <w:tcW w:type="dxa" w:w="450"/>
+            <w:shd w:fill="F2F2F2" w:val="clear"/>
           </w:tcPr>
           <w:p>
             <w:r>
@@ -13162,6 +13363,7 @@
         <w:tc>
           <w:tcPr>
             <w:tcW w:type="dxa" w:w="450"/>
+            <w:shd w:fill="F2F2F2" w:val="clear"/>
           </w:tcPr>
           <w:p>
             <w:r>
@@ -13172,6 +13374,7 @@
         <w:tc>
           <w:tcPr>
             <w:tcW w:type="dxa" w:w="1432"/>
+            <w:shd w:fill="F2F2F2" w:val="clear"/>
           </w:tcPr>
           <w:p>
             <w:r>
@@ -13182,6 +13385,7 @@
         <w:tc>
           <w:tcPr>
             <w:tcW w:type="dxa" w:w="452"/>
+            <w:shd w:fill="F2F2F2" w:val="clear"/>
           </w:tcPr>
           <w:p>
             <w:r>
@@ -13192,6 +13396,7 @@
         <w:tc>
           <w:tcPr>
             <w:tcW w:type="dxa" w:w="362"/>
+            <w:shd w:fill="F2F2F2" w:val="clear"/>
           </w:tcPr>
           <w:p>
             <w:r/>
@@ -13200,6 +13405,7 @@
         <w:tc>
           <w:tcPr>
             <w:tcW w:type="dxa" w:w="452"/>
+            <w:shd w:fill="F2F2F2" w:val="clear"/>
           </w:tcPr>
           <w:p>
             <w:r/>
@@ -13208,6 +13414,7 @@
         <w:tc>
           <w:tcPr>
             <w:tcW w:type="dxa" w:w="452"/>
+            <w:shd w:fill="F2F2F2" w:val="clear"/>
           </w:tcPr>
           <w:p>
             <w:r/>
@@ -13216,6 +13423,7 @@
         <w:tc>
           <w:tcPr>
             <w:tcW w:type="dxa" w:w="362"/>
+            <w:shd w:fill="F2F2F2" w:val="clear"/>
           </w:tcPr>
           <w:p>
             <w:r>
@@ -13226,6 +13434,7 @@
         <w:tc>
           <w:tcPr>
             <w:tcW w:type="dxa" w:w="452"/>
+            <w:shd w:fill="F2F2F2" w:val="clear"/>
           </w:tcPr>
           <w:p>
             <w:r/>
@@ -13234,6 +13443,7 @@
         <w:tc>
           <w:tcPr>
             <w:tcW w:type="dxa" w:w="452"/>
+            <w:shd w:fill="F2F2F2" w:val="clear"/>
           </w:tcPr>
           <w:p>
             <w:r/>
@@ -13242,6 +13452,7 @@
         <w:tc>
           <w:tcPr>
             <w:tcW w:type="dxa" w:w="452"/>
+            <w:shd w:fill="F2F2F2" w:val="clear"/>
           </w:tcPr>
           <w:p>
             <w:r/>
@@ -13250,6 +13461,7 @@
         <w:tc>
           <w:tcPr>
             <w:tcW w:type="dxa" w:w="452"/>
+            <w:shd w:fill="F2F2F2" w:val="clear"/>
           </w:tcPr>
           <w:p>
             <w:r>
@@ -13260,6 +13472,7 @@
         <w:tc>
           <w:tcPr>
             <w:tcW w:type="dxa" w:w="362"/>
+            <w:shd w:fill="F2F2F2" w:val="clear"/>
           </w:tcPr>
           <w:p>
             <w:r/>
@@ -13268,6 +13481,7 @@
         <w:tc>
           <w:tcPr>
             <w:tcW w:type="dxa" w:w="452"/>
+            <w:shd w:fill="F2F2F2" w:val="clear"/>
           </w:tcPr>
           <w:p>
             <w:r/>
@@ -13276,6 +13490,7 @@
         <w:tc>
           <w:tcPr>
             <w:tcW w:type="dxa" w:w="452"/>
+            <w:shd w:fill="F2F2F2" w:val="clear"/>
           </w:tcPr>
           <w:p>
             <w:r/>
@@ -13448,6 +13663,7 @@
         <w:tc>
           <w:tcPr>
             <w:tcW w:type="dxa" w:w="1348"/>
+            <w:shd w:fill="F2F2F2" w:val="clear"/>
           </w:tcPr>
           <w:p>
             <w:r>
@@ -13458,6 +13674,7 @@
         <w:tc>
           <w:tcPr>
             <w:tcW w:type="dxa" w:w="656"/>
+            <w:shd w:fill="F2F2F2" w:val="clear"/>
           </w:tcPr>
           <w:p>
             <w:r>
@@ -13468,6 +13685,7 @@
         <w:tc>
           <w:tcPr>
             <w:tcW w:type="dxa" w:w="450"/>
+            <w:shd w:fill="F2F2F2" w:val="clear"/>
           </w:tcPr>
           <w:p>
             <w:r>
@@ -13478,6 +13696,7 @@
         <w:tc>
           <w:tcPr>
             <w:tcW w:type="dxa" w:w="450"/>
+            <w:shd w:fill="F2F2F2" w:val="clear"/>
           </w:tcPr>
           <w:p>
             <w:r>
@@ -13488,6 +13707,7 @@
         <w:tc>
           <w:tcPr>
             <w:tcW w:type="dxa" w:w="1432"/>
+            <w:shd w:fill="F2F2F2" w:val="clear"/>
           </w:tcPr>
           <w:p>
             <w:r>
@@ -13498,6 +13718,7 @@
         <w:tc>
           <w:tcPr>
             <w:tcW w:type="dxa" w:w="452"/>
+            <w:shd w:fill="F2F2F2" w:val="clear"/>
           </w:tcPr>
           <w:p>
             <w:r>
@@ -13508,6 +13729,7 @@
         <w:tc>
           <w:tcPr>
             <w:tcW w:type="dxa" w:w="362"/>
+            <w:shd w:fill="F2F2F2" w:val="clear"/>
           </w:tcPr>
           <w:p>
             <w:r>
@@ -13518,6 +13740,7 @@
         <w:tc>
           <w:tcPr>
             <w:tcW w:type="dxa" w:w="452"/>
+            <w:shd w:fill="F2F2F2" w:val="clear"/>
           </w:tcPr>
           <w:p>
             <w:r>
@@ -13528,6 +13751,7 @@
         <w:tc>
           <w:tcPr>
             <w:tcW w:type="dxa" w:w="452"/>
+            <w:shd w:fill="F2F2F2" w:val="clear"/>
           </w:tcPr>
           <w:p>
             <w:r>
@@ -13538,6 +13762,7 @@
         <w:tc>
           <w:tcPr>
             <w:tcW w:type="dxa" w:w="362"/>
+            <w:shd w:fill="F2F2F2" w:val="clear"/>
           </w:tcPr>
           <w:p>
             <w:r>
@@ -13548,6 +13773,7 @@
         <w:tc>
           <w:tcPr>
             <w:tcW w:type="dxa" w:w="452"/>
+            <w:shd w:fill="F2F2F2" w:val="clear"/>
           </w:tcPr>
           <w:p>
             <w:r>
@@ -13558,6 +13784,7 @@
         <w:tc>
           <w:tcPr>
             <w:tcW w:type="dxa" w:w="452"/>
+            <w:shd w:fill="F2F2F2" w:val="clear"/>
           </w:tcPr>
           <w:p>
             <w:r>
@@ -13568,6 +13795,7 @@
         <w:tc>
           <w:tcPr>
             <w:tcW w:type="dxa" w:w="452"/>
+            <w:shd w:fill="F2F2F2" w:val="clear"/>
           </w:tcPr>
           <w:p>
             <w:r>
@@ -13578,6 +13806,7 @@
         <w:tc>
           <w:tcPr>
             <w:tcW w:type="dxa" w:w="452"/>
+            <w:shd w:fill="F2F2F2" w:val="clear"/>
           </w:tcPr>
           <w:p>
             <w:r>
@@ -13588,6 +13817,7 @@
         <w:tc>
           <w:tcPr>
             <w:tcW w:type="dxa" w:w="362"/>
+            <w:shd w:fill="F2F2F2" w:val="clear"/>
           </w:tcPr>
           <w:p>
             <w:r/>
@@ -13596,6 +13826,7 @@
         <w:tc>
           <w:tcPr>
             <w:tcW w:type="dxa" w:w="452"/>
+            <w:shd w:fill="F2F2F2" w:val="clear"/>
           </w:tcPr>
           <w:p>
             <w:r/>
@@ -13604,6 +13835,7 @@
         <w:tc>
           <w:tcPr>
             <w:tcW w:type="dxa" w:w="452"/>
+            <w:shd w:fill="F2F2F2" w:val="clear"/>
           </w:tcPr>
           <w:p>
             <w:r/>
@@ -13768,6 +14000,7 @@
         <w:tc>
           <w:tcPr>
             <w:tcW w:type="dxa" w:w="1348"/>
+            <w:shd w:fill="F2F2F2" w:val="clear"/>
           </w:tcPr>
           <w:p>
             <w:r>
@@ -13778,6 +14011,7 @@
         <w:tc>
           <w:tcPr>
             <w:tcW w:type="dxa" w:w="656"/>
+            <w:shd w:fill="F2F2F2" w:val="clear"/>
           </w:tcPr>
           <w:p>
             <w:r>
@@ -13788,6 +14022,7 @@
         <w:tc>
           <w:tcPr>
             <w:tcW w:type="dxa" w:w="450"/>
+            <w:shd w:fill="F2F2F2" w:val="clear"/>
           </w:tcPr>
           <w:p>
             <w:r>
@@ -13798,6 +14033,7 @@
         <w:tc>
           <w:tcPr>
             <w:tcW w:type="dxa" w:w="450"/>
+            <w:shd w:fill="F2F2F2" w:val="clear"/>
           </w:tcPr>
           <w:p>
             <w:r>
@@ -13808,6 +14044,7 @@
         <w:tc>
           <w:tcPr>
             <w:tcW w:type="dxa" w:w="1432"/>
+            <w:shd w:fill="F2F2F2" w:val="clear"/>
           </w:tcPr>
           <w:p>
             <w:r>
@@ -13818,6 +14055,7 @@
         <w:tc>
           <w:tcPr>
             <w:tcW w:type="dxa" w:w="452"/>
+            <w:shd w:fill="F2F2F2" w:val="clear"/>
           </w:tcPr>
           <w:p>
             <w:r>
@@ -13828,6 +14066,7 @@
         <w:tc>
           <w:tcPr>
             <w:tcW w:type="dxa" w:w="362"/>
+            <w:shd w:fill="F2F2F2" w:val="clear"/>
           </w:tcPr>
           <w:p>
             <w:r/>
@@ -13836,6 +14075,7 @@
         <w:tc>
           <w:tcPr>
             <w:tcW w:type="dxa" w:w="452"/>
+            <w:shd w:fill="F2F2F2" w:val="clear"/>
           </w:tcPr>
           <w:p>
             <w:r/>
@@ -13844,6 +14084,7 @@
         <w:tc>
           <w:tcPr>
             <w:tcW w:type="dxa" w:w="452"/>
+            <w:shd w:fill="F2F2F2" w:val="clear"/>
           </w:tcPr>
           <w:p>
             <w:r/>
@@ -13852,6 +14093,7 @@
         <w:tc>
           <w:tcPr>
             <w:tcW w:type="dxa" w:w="362"/>
+            <w:shd w:fill="F2F2F2" w:val="clear"/>
           </w:tcPr>
           <w:p>
             <w:r>
@@ -13862,6 +14104,7 @@
         <w:tc>
           <w:tcPr>
             <w:tcW w:type="dxa" w:w="452"/>
+            <w:shd w:fill="F2F2F2" w:val="clear"/>
           </w:tcPr>
           <w:p>
             <w:r/>
@@ -13870,6 +14113,7 @@
         <w:tc>
           <w:tcPr>
             <w:tcW w:type="dxa" w:w="452"/>
+            <w:shd w:fill="F2F2F2" w:val="clear"/>
           </w:tcPr>
           <w:p>
             <w:r/>
@@ -13878,6 +14122,7 @@
         <w:tc>
           <w:tcPr>
             <w:tcW w:type="dxa" w:w="452"/>
+            <w:shd w:fill="F2F2F2" w:val="clear"/>
           </w:tcPr>
           <w:p>
             <w:r/>
@@ -13886,6 +14131,7 @@
         <w:tc>
           <w:tcPr>
             <w:tcW w:type="dxa" w:w="452"/>
+            <w:shd w:fill="F2F2F2" w:val="clear"/>
           </w:tcPr>
           <w:p>
             <w:r>
@@ -13896,6 +14142,7 @@
         <w:tc>
           <w:tcPr>
             <w:tcW w:type="dxa" w:w="362"/>
+            <w:shd w:fill="F2F2F2" w:val="clear"/>
           </w:tcPr>
           <w:p>
             <w:r/>
@@ -13904,6 +14151,7 @@
         <w:tc>
           <w:tcPr>
             <w:tcW w:type="dxa" w:w="452"/>
+            <w:shd w:fill="F2F2F2" w:val="clear"/>
           </w:tcPr>
           <w:p>
             <w:r/>
@@ -13912,6 +14160,7 @@
         <w:tc>
           <w:tcPr>
             <w:tcW w:type="dxa" w:w="452"/>
+            <w:shd w:fill="F2F2F2" w:val="clear"/>
           </w:tcPr>
           <w:p>
             <w:r/>
@@ -14783,7 +15032,7 @@
           <w:tcPr>
             <w:cnfStyle w:val="001000000000" w:firstRow="0" w:lastRow="0" w:firstColumn="1" w:lastColumn="0" w:oddVBand="0" w:evenVBand="0" w:oddHBand="0" w:evenHBand="0" w:firstRowFirstColumn="0" w:firstRowLastColumn="0" w:lastRowFirstColumn="0" w:lastRowLastColumn="0"/>
             <w:tcW w:w="3423" w:type="dxa"/>
-            <w:shd w:val="clear" w:color="auto" w:fill="AEAAAA" w:themeFill="background2" w:themeFillShade="BF"/>
+            <w:shd w:fill="AEAAAA" w:val="clear"/>
           </w:tcPr>
           <w:p>
             <w:pPr>
@@ -14799,6 +15048,8 @@
             <w:r>
               <w:rPr>
                 <w:rFonts w:ascii="Times New Roman" w:hAnsi="Times New Roman" w:cs="Times New Roman"/>
+                <w:b/>
+                <w:color w:val="FFFFFF"/>
                 <w:sz w:val="24"/>
                 <w:szCs w:val="24"/>
                 <w:lang w:val="en-US"/>
@@ -14810,7 +15061,7 @@
         <w:tc>
           <w:tcPr>
             <w:tcW w:w="2582" w:type="dxa"/>
-            <w:shd w:val="clear" w:color="auto" w:fill="AEAAAA" w:themeFill="background2" w:themeFillShade="BF"/>
+            <w:shd w:fill="AEAAAA" w:val="clear"/>
           </w:tcPr>
           <w:p>
             <w:pPr>
@@ -14827,6 +15078,8 @@
             <w:r>
               <w:rPr>
                 <w:rFonts w:ascii="Times New Roman" w:hAnsi="Times New Roman" w:cs="Times New Roman"/>
+                <w:b/>
+                <w:color w:val="FFFFFF"/>
                 <w:sz w:val="24"/>
                 <w:szCs w:val="24"/>
                 <w:lang w:val="en-US"/>
@@ -14834,49 +15087,55 @@
               <w:t xml:space="preserve">Salesforce </w:t>
             </w:r>
             <w:r>
+              <w:rPr>
+                <w:rFonts w:ascii="Times New Roman" w:hAnsi="Times New Roman" w:cs="Times New Roman"/>
+                <w:b/>
+                <w:color w:val="FFFFFF"/>
+                <w:sz w:val="24"/>
+                <w:szCs w:val="24"/>
+                <w:lang w:val="en-US"/>
+              </w:rPr>
+              <w:t>Profile</w:t>
+            </w:r>
+          </w:p>
+        </w:tc>
+        <w:tc>
+          <w:tcPr>
+            <w:tcW w:w="3445" w:type="dxa"/>
+            <w:shd w:fill="AEAAAA" w:val="clear"/>
+          </w:tcPr>
+          <w:p>
+            <w:pPr>
+              <w:spacing w:before="120" w:after="120" w:line="276" w:lineRule="auto"/>
+              <w:jc w:val="center"/>
+              <w:cnfStyle w:val="100000000000" w:firstRow="1" w:lastRow="0" w:firstColumn="0" w:lastColumn="0" w:oddVBand="0" w:evenVBand="0" w:oddHBand="0" w:evenHBand="0" w:firstRowFirstColumn="0" w:firstRowLastColumn="0" w:lastRowFirstColumn="0" w:lastRowLastColumn="0"/>
               <w:rPr>
                 <w:rFonts w:ascii="Times New Roman" w:hAnsi="Times New Roman" w:cs="Times New Roman"/>
                 <w:sz w:val="24"/>
                 <w:szCs w:val="24"/>
                 <w:lang w:val="en-US"/>
               </w:rPr>
-              <w:t>Profile</w:t>
-            </w:r>
-          </w:p>
-        </w:tc>
-        <w:tc>
-          <w:tcPr>
-            <w:tcW w:w="3445" w:type="dxa"/>
-            <w:shd w:val="clear" w:color="auto" w:fill="AEAAAA" w:themeFill="background2" w:themeFillShade="BF"/>
-          </w:tcPr>
-          <w:p>
-            <w:pPr>
-              <w:spacing w:before="120" w:after="120" w:line="276" w:lineRule="auto"/>
-              <w:jc w:val="center"/>
-              <w:cnfStyle w:val="100000000000" w:firstRow="1" w:lastRow="0" w:firstColumn="0" w:lastColumn="0" w:oddVBand="0" w:evenVBand="0" w:oddHBand="0" w:evenHBand="0" w:firstRowFirstColumn="0" w:firstRowLastColumn="0" w:lastRowFirstColumn="0" w:lastRowLastColumn="0"/>
+            </w:pPr>
+            <w:r>
               <w:rPr>
                 <w:rFonts w:ascii="Times New Roman" w:hAnsi="Times New Roman" w:cs="Times New Roman"/>
+                <w:b/>
+                <w:color w:val="FFFFFF"/>
                 <w:sz w:val="24"/>
                 <w:szCs w:val="24"/>
                 <w:lang w:val="en-US"/>
               </w:rPr>
-            </w:pPr>
+              <w:t xml:space="preserve">Salesforce </w:t>
+            </w:r>
             <w:r>
               <w:rPr>
                 <w:rFonts w:ascii="Times New Roman" w:hAnsi="Times New Roman" w:cs="Times New Roman"/>
+                <w:b/>
+                <w:color w:val="FFFFFF"/>
                 <w:sz w:val="24"/>
                 <w:szCs w:val="24"/>
                 <w:lang w:val="en-US"/>
               </w:rPr>
-              <w:t xml:space="preserve">Salesforce </w:t>
-            </w:r>
-            <w:r>
-              <w:rPr>
-                <w:rFonts w:ascii="Times New Roman" w:hAnsi="Times New Roman" w:cs="Times New Roman"/>
-                <w:sz w:val="24"/>
-                <w:szCs w:val="24"/>
-                <w:lang w:val="en-US"/>
-              </w:rPr>
               <w:t>Permission set</w:t>
             </w:r>
           </w:p>
@@ -14918,6 +15177,7 @@
         <w:tc>
           <w:tcPr>
             <w:tcW w:type="dxa" w:w="3437"/>
+            <w:shd w:fill="F2F2F2" w:val="clear"/>
           </w:tcPr>
           <w:p>
             <w:r>
@@ -14928,6 +15188,7 @@
         <w:tc>
           <w:tcPr>
             <w:tcW w:type="dxa" w:w="2593"/>
+            <w:shd w:fill="F2F2F2" w:val="clear"/>
           </w:tcPr>
           <w:p>
             <w:r>
@@ -14938,6 +15199,7 @@
         <w:tc>
           <w:tcPr>
             <w:tcW w:type="dxa" w:w="3460"/>
+            <w:shd w:fill="F2F2F2" w:val="clear"/>
           </w:tcPr>
           <w:p>
             <w:r>
@@ -14982,6 +15244,7 @@
         <w:tc>
           <w:tcPr>
             <w:tcW w:type="dxa" w:w="3437"/>
+            <w:shd w:fill="F2F2F2" w:val="clear"/>
           </w:tcPr>
           <w:p>
             <w:r>
@@ -14992,6 +15255,7 @@
         <w:tc>
           <w:tcPr>
             <w:tcW w:type="dxa" w:w="2593"/>
+            <w:shd w:fill="F2F2F2" w:val="clear"/>
           </w:tcPr>
           <w:p>
             <w:r>
@@ -15002,6 +15266,7 @@
         <w:tc>
           <w:tcPr>
             <w:tcW w:type="dxa" w:w="3460"/>
+            <w:shd w:fill="F2F2F2" w:val="clear"/>
           </w:tcPr>
           <w:p>
             <w:r>
@@ -15360,51 +15625,47 @@
     <w:p>
       <w:pPr>
         <w:spacing w:before="120" w:line="276" w:lineRule="auto"/>
-        <w:rPr>
-          <w:rFonts w:ascii="Times New Roman" w:hAnsi="Times New Roman" w:cs="Times New Roman"/>
-          <w:sz w:val="24"/>
-          <w:szCs w:val="24"/>
-          <w:lang w:val="en-US"/>
-        </w:rPr>
-      </w:pPr>
-      <w:r>
-        <w:rPr>
-          <w:rFonts w:ascii="Times New Roman" w:hAnsi="Times New Roman" w:cs="Times New Roman"/>
-          <w:sz w:val="24"/>
-          <w:szCs w:val="24"/>
-          <w:lang w:val="en-US"/>
-        </w:rPr>
-        <w:t>The NPSP macro-process follows these primary flows:</w:t>
-        <w:br/>
-        <w:br/>
-        <w:t>DONATION PROCESSING FLOW:</w:t>
-        <w:br/>
-        <w:t xml:space="preserve">  [1] Gift Received → [2] Data Import/Gift Entry → [3] Contact/Account Matching →</w:t>
-        <w:br/>
-        <w:t xml:space="preserve">  [4] Opportunity Created → [5] Payment Created → [6] GAU Allocations →</w:t>
-        <w:br/>
-        <w:t xml:space="preserve">  [7] Rollup Calculations → [8] Level Assignment → [9] Acknowledgment</w:t>
-        <w:br/>
-        <w:br/>
-        <w:t>RECURRING DONATION FLOW:</w:t>
-        <w:br/>
-        <w:t xml:space="preserve">  [1] RD Created → [2] Schedule Generated → [3] Opportunities Projected →</w:t>
-        <w:br/>
-        <w:t xml:space="preserve">  [4] Elevate Commitment Synced → [5] Payments Matched → [6] Rollups Updated</w:t>
-        <w:br/>
-        <w:br/>
-        <w:t>HOUSEHOLD MANAGEMENT FLOW:</w:t>
-        <w:br/>
-        <w:t xml:space="preserve">  [1] Contact Created → [2] Account Assignment (Household/Org) →</w:t>
-        <w:br/>
-        <w:t xml:space="preserve">  [3] Address Management → [4] Household Naming → [5] Rollups Calculated</w:t>
-        <w:br/>
-        <w:br/>
-        <w:t>BATCH GIFT ENTRY FLOW:</w:t>
-        <w:br/>
-        <w:t xml:space="preserve">  [1] Batch Created → [2] Template Selected → [3] Gifts Added →</w:t>
-        <w:br/>
-        <w:t xml:space="preserve">  [4] Elevate Tokenization → [5] Review/Matching → [6] Batch Processing → [7] Commit</w:t>
+        <w:jc w:val="center"/>
+        <w:rPr>
+          <w:rFonts w:ascii="Times New Roman" w:hAnsi="Times New Roman" w:cs="Times New Roman"/>
+          <w:sz w:val="24"/>
+          <w:szCs w:val="24"/>
+          <w:lang w:val="en-US"/>
+        </w:rPr>
+      </w:pPr>
+      <w:r>
+        <w:drawing>
+          <wp:inline xmlns:a="http://schemas.openxmlformats.org/drawingml/2006/main" xmlns:pic="http://schemas.openxmlformats.org/drawingml/2006/picture">
+            <wp:extent cx="5029200" cy="5908253"/>
+            <wp:docPr id="17" name="Picture 17"/>
+            <wp:cNvGraphicFramePr>
+              <a:graphicFrameLocks noChangeAspect="1"/>
+            </wp:cNvGraphicFramePr>
+            <a:graphic>
+              <a:graphicData uri="http://schemas.openxmlformats.org/drawingml/2006/picture">
+                <pic:pic>
+                  <pic:nvPicPr>
+                    <pic:cNvPr id="0" name="npsp_process_diagram.png"/>
+                    <pic:cNvPicPr/>
+                  </pic:nvPicPr>
+                  <pic:blipFill>
+                    <a:blip r:embed="rId21"/>
+                    <a:stretch>
+                      <a:fillRect/>
+                    </a:stretch>
+                  </pic:blipFill>
+                  <pic:spPr>
+                    <a:xfrm>
+                      <a:off x="0" y="0"/>
+                      <a:ext cx="5029200" cy="5908253"/>
+                    </a:xfrm>
+                    <a:prstGeom prst="rect"/>
+                  </pic:spPr>
+                </pic:pic>
+              </a:graphicData>
+            </a:graphic>
+          </wp:inline>
+        </w:drawing>
       </w:r>
     </w:p>
     <w:p>
@@ -15680,7 +15941,7 @@
           <w:tcPr>
             <w:cnfStyle w:val="001000000000" w:firstRow="0" w:lastRow="0" w:firstColumn="1" w:lastColumn="0" w:oddVBand="0" w:evenVBand="0" w:oddHBand="0" w:evenHBand="0" w:firstRowFirstColumn="0" w:firstRowLastColumn="0" w:lastRowFirstColumn="0" w:lastRowLastColumn="0"/>
             <w:tcW w:w="553" w:type="dxa"/>
-            <w:shd w:val="clear" w:color="auto" w:fill="AEAAAA" w:themeFill="background2" w:themeFillShade="BF"/>
+            <w:shd w:fill="AEAAAA" w:val="clear"/>
           </w:tcPr>
           <w:p>
             <w:pPr>
@@ -15697,7 +15958,8 @@
             <w:r>
               <w:rPr>
                 <w:rFonts w:ascii="Times New Roman" w:hAnsi="Times New Roman" w:cs="Times New Roman"/>
-                <w:color w:val="000000" w:themeColor="text1"/>
+                <w:b/>
+                <w:color w:val="FFFFFF"/>
                 <w:sz w:val="24"/>
                 <w:szCs w:val="24"/>
                 <w:lang w:val="en-US"/>
@@ -15709,7 +15971,7 @@
         <w:tc>
           <w:tcPr>
             <w:tcW w:w="2277" w:type="dxa"/>
-            <w:shd w:val="clear" w:color="auto" w:fill="AEAAAA" w:themeFill="background2" w:themeFillShade="BF"/>
+            <w:shd w:fill="AEAAAA" w:val="clear"/>
           </w:tcPr>
           <w:p>
             <w:pPr>
@@ -15726,7 +15988,8 @@
             <w:r>
               <w:rPr>
                 <w:rFonts w:ascii="Times New Roman" w:hAnsi="Times New Roman" w:cs="Times New Roman"/>
-                <w:color w:val="000000" w:themeColor="text1"/>
+                <w:b/>
+                <w:color w:val="FFFFFF"/>
                 <w:sz w:val="24"/>
                 <w:szCs w:val="24"/>
                 <w:lang w:val="en-US"/>
@@ -15738,7 +16001,7 @@
         <w:tc>
           <w:tcPr>
             <w:tcW w:w="5954" w:type="dxa"/>
-            <w:shd w:val="clear" w:color="auto" w:fill="AEAAAA" w:themeFill="background2" w:themeFillShade="BF"/>
+            <w:shd w:fill="AEAAAA" w:val="clear"/>
           </w:tcPr>
           <w:p>
             <w:pPr>
@@ -15755,7 +16018,8 @@
             <w:r>
               <w:rPr>
                 <w:rFonts w:ascii="Times New Roman" w:hAnsi="Times New Roman" w:cs="Times New Roman"/>
-                <w:color w:val="000000" w:themeColor="text1"/>
+                <w:b/>
+                <w:color w:val="FFFFFF"/>
                 <w:sz w:val="24"/>
                 <w:szCs w:val="24"/>
                 <w:lang w:val="en-US"/>
@@ -15767,7 +16031,7 @@
         <w:tc>
           <w:tcPr>
             <w:tcW w:w="709" w:type="dxa"/>
-            <w:shd w:val="clear" w:color="auto" w:fill="AEAAAA" w:themeFill="background2" w:themeFillShade="BF"/>
+            <w:shd w:fill="AEAAAA" w:val="clear"/>
           </w:tcPr>
           <w:p>
             <w:pPr>
@@ -15785,7 +16049,8 @@
             <w:r>
               <w:rPr>
                 <w:rFonts w:ascii="Times New Roman" w:hAnsi="Times New Roman" w:cs="Times New Roman"/>
-                <w:color w:val="000000" w:themeColor="text1"/>
+                <w:b/>
+                <w:color w:val="FFFFFF"/>
                 <w:sz w:val="24"/>
                 <w:szCs w:val="24"/>
                 <w:lang w:val="en-US"/>
@@ -15841,6 +16106,7 @@
         <w:tc>
           <w:tcPr>
             <w:tcW w:type="dxa" w:w="553"/>
+            <w:shd w:fill="F2F2F2" w:val="clear"/>
           </w:tcPr>
           <w:p>
             <w:r>
@@ -15851,6 +16117,7 @@
         <w:tc>
           <w:tcPr>
             <w:tcW w:type="dxa" w:w="2277"/>
+            <w:shd w:fill="F2F2F2" w:val="clear"/>
           </w:tcPr>
           <w:p>
             <w:r>
@@ -15861,6 +16128,7 @@
         <w:tc>
           <w:tcPr>
             <w:tcW w:type="dxa" w:w="5954"/>
+            <w:shd w:fill="F2F2F2" w:val="clear"/>
           </w:tcPr>
           <w:p>
             <w:r>
@@ -15871,6 +16139,7 @@
         <w:tc>
           <w:tcPr>
             <w:tcW w:type="dxa" w:w="709"/>
+            <w:shd w:fill="F2F2F2" w:val="clear"/>
           </w:tcPr>
           <w:p>
             <w:r>
@@ -15925,6 +16194,7 @@
         <w:tc>
           <w:tcPr>
             <w:tcW w:type="dxa" w:w="553"/>
+            <w:shd w:fill="F2F2F2" w:val="clear"/>
           </w:tcPr>
           <w:p>
             <w:r>
@@ -15935,6 +16205,7 @@
         <w:tc>
           <w:tcPr>
             <w:tcW w:type="dxa" w:w="2277"/>
+            <w:shd w:fill="F2F2F2" w:val="clear"/>
           </w:tcPr>
           <w:p>
             <w:r>
@@ -15945,6 +16216,7 @@
         <w:tc>
           <w:tcPr>
             <w:tcW w:type="dxa" w:w="5954"/>
+            <w:shd w:fill="F2F2F2" w:val="clear"/>
           </w:tcPr>
           <w:p>
             <w:r>
@@ -15955,6 +16227,7 @@
         <w:tc>
           <w:tcPr>
             <w:tcW w:type="dxa" w:w="709"/>
+            <w:shd w:fill="F2F2F2" w:val="clear"/>
           </w:tcPr>
           <w:p>
             <w:r>
@@ -16009,6 +16282,7 @@
         <w:tc>
           <w:tcPr>
             <w:tcW w:type="dxa" w:w="553"/>
+            <w:shd w:fill="F2F2F2" w:val="clear"/>
           </w:tcPr>
           <w:p>
             <w:r>
@@ -16019,6 +16293,7 @@
         <w:tc>
           <w:tcPr>
             <w:tcW w:type="dxa" w:w="2277"/>
+            <w:shd w:fill="F2F2F2" w:val="clear"/>
           </w:tcPr>
           <w:p>
             <w:r>
@@ -16029,6 +16304,7 @@
         <w:tc>
           <w:tcPr>
             <w:tcW w:type="dxa" w:w="5954"/>
+            <w:shd w:fill="F2F2F2" w:val="clear"/>
           </w:tcPr>
           <w:p>
             <w:r>
@@ -16039,6 +16315,7 @@
         <w:tc>
           <w:tcPr>
             <w:tcW w:type="dxa" w:w="709"/>
+            <w:shd w:fill="F2F2F2" w:val="clear"/>
           </w:tcPr>
           <w:p>
             <w:r>
@@ -16093,6 +16370,7 @@
         <w:tc>
           <w:tcPr>
             <w:tcW w:type="dxa" w:w="553"/>
+            <w:shd w:fill="F2F2F2" w:val="clear"/>
           </w:tcPr>
           <w:p>
             <w:r>
@@ -16103,6 +16381,7 @@
         <w:tc>
           <w:tcPr>
             <w:tcW w:type="dxa" w:w="2277"/>
+            <w:shd w:fill="F2F2F2" w:val="clear"/>
           </w:tcPr>
           <w:p>
             <w:r>
@@ -16113,6 +16392,7 @@
         <w:tc>
           <w:tcPr>
             <w:tcW w:type="dxa" w:w="5954"/>
+            <w:shd w:fill="F2F2F2" w:val="clear"/>
           </w:tcPr>
           <w:p>
             <w:r>
@@ -16123,6 +16403,7 @@
         <w:tc>
           <w:tcPr>
             <w:tcW w:type="dxa" w:w="709"/>
+            <w:shd w:fill="F2F2F2" w:val="clear"/>
           </w:tcPr>
           <w:p>
             <w:r>
@@ -16302,7 +16583,7 @@
           <w:tcPr>
             <w:cnfStyle w:val="001000000000" w:firstRow="0" w:lastRow="0" w:firstColumn="1" w:lastColumn="0" w:oddVBand="0" w:evenVBand="0" w:oddHBand="0" w:evenHBand="0" w:firstRowFirstColumn="0" w:firstRowLastColumn="0" w:lastRowFirstColumn="0" w:lastRowLastColumn="0"/>
             <w:tcW w:w="2785" w:type="dxa"/>
-            <w:shd w:val="clear" w:color="auto" w:fill="AEAAAA" w:themeFill="background2" w:themeFillShade="BF"/>
+            <w:shd w:fill="AEAAAA" w:val="clear"/>
           </w:tcPr>
           <w:p>
             <w:pPr>
@@ -16319,7 +16600,8 @@
             <w:r>
               <w:rPr>
                 <w:rFonts w:ascii="Times New Roman" w:eastAsia="Times New Roman" w:hAnsi="Times New Roman" w:cs="Times New Roman"/>
-                <w:color w:val="000000" w:themeColor="text1"/>
+                <w:b/>
+                <w:color w:val="FFFFFF"/>
                 <w:sz w:val="24"/>
                 <w:szCs w:val="24"/>
                 <w:lang w:val="en-US"/>
@@ -16331,7 +16613,7 @@
         <w:tc>
           <w:tcPr>
             <w:tcW w:w="2250" w:type="dxa"/>
-            <w:shd w:val="clear" w:color="auto" w:fill="AEAAAA" w:themeFill="background2" w:themeFillShade="BF"/>
+            <w:shd w:fill="AEAAAA" w:val="clear"/>
           </w:tcPr>
           <w:p>
             <w:pPr>
@@ -16348,7 +16630,8 @@
             <w:r>
               <w:rPr>
                 <w:rFonts w:ascii="Times New Roman" w:eastAsia="Times New Roman" w:hAnsi="Times New Roman" w:cs="Times New Roman"/>
-                <w:color w:val="000000" w:themeColor="text1"/>
+                <w:b/>
+                <w:color w:val="FFFFFF"/>
                 <w:sz w:val="24"/>
                 <w:szCs w:val="24"/>
                 <w:lang w:val="en-US"/>
@@ -16360,7 +16643,7 @@
         <w:tc>
           <w:tcPr>
             <w:tcW w:w="2160" w:type="dxa"/>
-            <w:shd w:val="clear" w:color="auto" w:fill="AEAAAA" w:themeFill="background2" w:themeFillShade="BF"/>
+            <w:shd w:fill="AEAAAA" w:val="clear"/>
           </w:tcPr>
           <w:p>
             <w:pPr>
@@ -16377,7 +16660,8 @@
             <w:r>
               <w:rPr>
                 <w:rFonts w:ascii="Times New Roman" w:eastAsia="Times New Roman" w:hAnsi="Times New Roman" w:cs="Times New Roman"/>
-                <w:color w:val="000000" w:themeColor="text1"/>
+                <w:b/>
+                <w:color w:val="FFFFFF"/>
                 <w:sz w:val="24"/>
                 <w:szCs w:val="24"/>
                 <w:lang w:val="en-US"/>
@@ -16389,7 +16673,7 @@
         <w:tc>
           <w:tcPr>
             <w:tcW w:w="2298" w:type="dxa"/>
-            <w:shd w:val="clear" w:color="auto" w:fill="AEAAAA" w:themeFill="background2" w:themeFillShade="BF"/>
+            <w:shd w:fill="AEAAAA" w:val="clear"/>
           </w:tcPr>
           <w:p>
             <w:pPr>
@@ -16407,7 +16691,8 @@
             <w:r>
               <w:rPr>
                 <w:rFonts w:ascii="Times New Roman" w:eastAsia="Times New Roman" w:hAnsi="Times New Roman" w:cs="Times New Roman"/>
-                <w:color w:val="000000" w:themeColor="text1"/>
+                <w:b/>
+                <w:color w:val="FFFFFF"/>
                 <w:sz w:val="24"/>
                 <w:szCs w:val="24"/>
                 <w:lang w:val="en-US"/>
@@ -16463,6 +16748,7 @@
         <w:tc>
           <w:tcPr>
             <w:tcW w:type="dxa" w:w="2785"/>
+            <w:shd w:fill="F2F2F2" w:val="clear"/>
           </w:tcPr>
           <w:p>
             <w:r>
@@ -16473,6 +16759,7 @@
         <w:tc>
           <w:tcPr>
             <w:tcW w:type="dxa" w:w="2250"/>
+            <w:shd w:fill="F2F2F2" w:val="clear"/>
           </w:tcPr>
           <w:p>
             <w:r>
@@ -16483,6 +16770,7 @@
         <w:tc>
           <w:tcPr>
             <w:tcW w:type="dxa" w:w="2160"/>
+            <w:shd w:fill="F2F2F2" w:val="clear"/>
           </w:tcPr>
           <w:p>
             <w:r>
@@ -16493,6 +16781,7 @@
         <w:tc>
           <w:tcPr>
             <w:tcW w:type="dxa" w:w="2298"/>
+            <w:shd w:fill="F2F2F2" w:val="clear"/>
           </w:tcPr>
           <w:p>
             <w:r>
@@ -16547,6 +16836,7 @@
         <w:tc>
           <w:tcPr>
             <w:tcW w:type="dxa" w:w="2785"/>
+            <w:shd w:fill="F2F2F2" w:val="clear"/>
           </w:tcPr>
           <w:p>
             <w:r>
@@ -16557,6 +16847,7 @@
         <w:tc>
           <w:tcPr>
             <w:tcW w:type="dxa" w:w="2250"/>
+            <w:shd w:fill="F2F2F2" w:val="clear"/>
           </w:tcPr>
           <w:p>
             <w:r>
@@ -16567,6 +16858,7 @@
         <w:tc>
           <w:tcPr>
             <w:tcW w:type="dxa" w:w="2160"/>
+            <w:shd w:fill="F2F2F2" w:val="clear"/>
           </w:tcPr>
           <w:p>
             <w:r>
@@ -16577,6 +16869,7 @@
         <w:tc>
           <w:tcPr>
             <w:tcW w:type="dxa" w:w="2298"/>
+            <w:shd w:fill="F2F2F2" w:val="clear"/>
           </w:tcPr>
           <w:p>
             <w:r>
@@ -16631,6 +16924,7 @@
         <w:tc>
           <w:tcPr>
             <w:tcW w:type="dxa" w:w="2785"/>
+            <w:shd w:fill="F2F2F2" w:val="clear"/>
           </w:tcPr>
           <w:p>
             <w:r>
@@ -16641,6 +16935,7 @@
         <w:tc>
           <w:tcPr>
             <w:tcW w:type="dxa" w:w="2250"/>
+            <w:shd w:fill="F2F2F2" w:val="clear"/>
           </w:tcPr>
           <w:p>
             <w:r>
@@ -16651,6 +16946,7 @@
         <w:tc>
           <w:tcPr>
             <w:tcW w:type="dxa" w:w="2160"/>
+            <w:shd w:fill="F2F2F2" w:val="clear"/>
           </w:tcPr>
           <w:p>
             <w:r>
@@ -16661,6 +16957,7 @@
         <w:tc>
           <w:tcPr>
             <w:tcW w:type="dxa" w:w="2298"/>
+            <w:shd w:fill="F2F2F2" w:val="clear"/>
           </w:tcPr>
           <w:p>
             <w:r>
@@ -16715,6 +17012,7 @@
         <w:tc>
           <w:tcPr>
             <w:tcW w:type="dxa" w:w="2785"/>
+            <w:shd w:fill="F2F2F2" w:val="clear"/>
           </w:tcPr>
           <w:p>
             <w:r>
@@ -16725,6 +17023,7 @@
         <w:tc>
           <w:tcPr>
             <w:tcW w:type="dxa" w:w="2250"/>
+            <w:shd w:fill="F2F2F2" w:val="clear"/>
           </w:tcPr>
           <w:p>
             <w:r>
@@ -16735,6 +17034,7 @@
         <w:tc>
           <w:tcPr>
             <w:tcW w:type="dxa" w:w="2160"/>
+            <w:shd w:fill="F2F2F2" w:val="clear"/>
           </w:tcPr>
           <w:p>
             <w:r>
@@ -16745,6 +17045,7 @@
         <w:tc>
           <w:tcPr>
             <w:tcW w:type="dxa" w:w="2298"/>
+            <w:shd w:fill="F2F2F2" w:val="clear"/>
           </w:tcPr>
           <w:p>
             <w:r>
@@ -16877,6 +17178,7 @@
           <w:tcPr>
             <w:cnfStyle w:val="001000000000" w:firstRow="0" w:lastRow="0" w:firstColumn="1" w:lastColumn="0" w:oddVBand="0" w:evenVBand="0" w:oddHBand="0" w:evenHBand="0" w:firstRowFirstColumn="0" w:firstRowLastColumn="0" w:lastRowFirstColumn="0" w:lastRowLastColumn="0"/>
             <w:tcW w:w="2875" w:type="dxa"/>
+            <w:shd w:fill="AEAAAA" w:val="clear"/>
           </w:tcPr>
           <w:p>
             <w:pPr>
@@ -16891,6 +17193,8 @@
             <w:r>
               <w:rPr>
                 <w:rFonts w:ascii="Times New Roman" w:hAnsi="Times New Roman" w:cs="Times New Roman"/>
+                <w:b/>
+                <w:color w:val="FFFFFF"/>
                 <w:sz w:val="24"/>
                 <w:szCs w:val="24"/>
                 <w:lang w:val="en-US"/>
@@ -16902,6 +17206,7 @@
         <w:tc>
           <w:tcPr>
             <w:tcW w:w="3440" w:type="dxa"/>
+            <w:shd w:fill="AEAAAA" w:val="clear"/>
           </w:tcPr>
           <w:p>
             <w:pPr>
@@ -16921,6 +17226,7 @@
                 <w:rFonts w:ascii="Times New Roman" w:hAnsi="Times New Roman" w:cs="Times New Roman"/>
                 <w:b/>
                 <w:bCs/>
+                <w:color w:val="FFFFFF"/>
                 <w:sz w:val="24"/>
                 <w:szCs w:val="24"/>
                 <w:lang w:val="en-US"/>
@@ -16928,6 +17234,52 @@
               <w:t>Permission Set</w:t>
             </w:r>
             <w:r>
+              <w:rPr>
+                <w:rFonts w:ascii="Times New Roman" w:hAnsi="Times New Roman" w:cs="Times New Roman"/>
+                <w:b/>
+                <w:bCs/>
+                <w:color w:val="FFFFFF"/>
+                <w:sz w:val="24"/>
+                <w:szCs w:val="24"/>
+                <w:lang w:val="en-US"/>
+              </w:rPr>
+              <w:t>(</w:t>
+            </w:r>
+            <w:r>
+              <w:rPr>
+                <w:rFonts w:ascii="Times New Roman" w:hAnsi="Times New Roman" w:cs="Times New Roman"/>
+                <w:b/>
+                <w:bCs/>
+                <w:color w:val="FFFFFF"/>
+                <w:sz w:val="24"/>
+                <w:szCs w:val="24"/>
+                <w:lang w:val="en-US"/>
+              </w:rPr>
+              <w:t>s</w:t>
+            </w:r>
+            <w:r>
+              <w:rPr>
+                <w:rFonts w:ascii="Times New Roman" w:hAnsi="Times New Roman" w:cs="Times New Roman"/>
+                <w:b/>
+                <w:bCs/>
+                <w:color w:val="FFFFFF"/>
+                <w:sz w:val="24"/>
+                <w:szCs w:val="24"/>
+                <w:lang w:val="en-US"/>
+              </w:rPr>
+              <w:t>)</w:t>
+            </w:r>
+          </w:p>
+        </w:tc>
+        <w:tc>
+          <w:tcPr>
+            <w:tcW w:w="3175" w:type="dxa"/>
+            <w:shd w:fill="AEAAAA" w:val="clear"/>
+          </w:tcPr>
+          <w:p>
+            <w:pPr>
+              <w:spacing w:before="120" w:after="120" w:line="276" w:lineRule="auto"/>
+              <w:cnfStyle w:val="000000100000" w:firstRow="0" w:lastRow="0" w:firstColumn="0" w:lastColumn="0" w:oddVBand="0" w:evenVBand="0" w:oddHBand="1" w:evenHBand="0" w:firstRowFirstColumn="0" w:firstRowLastColumn="0" w:lastRowFirstColumn="0" w:lastRowLastColumn="0"/>
               <w:rPr>
                 <w:rFonts w:ascii="Times New Roman" w:hAnsi="Times New Roman" w:cs="Times New Roman"/>
                 <w:b/>
@@ -16936,69 +17288,29 @@
                 <w:szCs w:val="24"/>
                 <w:lang w:val="en-US"/>
               </w:rPr>
-              <w:t>(</w:t>
-            </w:r>
+            </w:pPr>
             <w:r>
               <w:rPr>
                 <w:rFonts w:ascii="Times New Roman" w:hAnsi="Times New Roman" w:cs="Times New Roman"/>
                 <w:b/>
                 <w:bCs/>
+                <w:color w:val="FFFFFF"/>
                 <w:sz w:val="24"/>
                 <w:szCs w:val="24"/>
                 <w:lang w:val="en-US"/>
               </w:rPr>
-              <w:t>s</w:t>
+              <w:t>SecRisk #</w:t>
             </w:r>
             <w:r>
               <w:rPr>
                 <w:rFonts w:ascii="Times New Roman" w:hAnsi="Times New Roman" w:cs="Times New Roman"/>
                 <w:b/>
                 <w:bCs/>
+                <w:color w:val="FFFFFF"/>
                 <w:sz w:val="24"/>
                 <w:szCs w:val="24"/>
                 <w:lang w:val="en-US"/>
               </w:rPr>
-              <w:t>)</w:t>
-            </w:r>
-          </w:p>
-        </w:tc>
-        <w:tc>
-          <w:tcPr>
-            <w:tcW w:w="3175" w:type="dxa"/>
-          </w:tcPr>
-          <w:p>
-            <w:pPr>
-              <w:spacing w:before="120" w:after="120" w:line="276" w:lineRule="auto"/>
-              <w:cnfStyle w:val="000000100000" w:firstRow="0" w:lastRow="0" w:firstColumn="0" w:lastColumn="0" w:oddVBand="0" w:evenVBand="0" w:oddHBand="1" w:evenHBand="0" w:firstRowFirstColumn="0" w:firstRowLastColumn="0" w:lastRowFirstColumn="0" w:lastRowLastColumn="0"/>
-              <w:rPr>
-                <w:rFonts w:ascii="Times New Roman" w:hAnsi="Times New Roman" w:cs="Times New Roman"/>
-                <w:b/>
-                <w:bCs/>
-                <w:sz w:val="24"/>
-                <w:szCs w:val="24"/>
-                <w:lang w:val="en-US"/>
-              </w:rPr>
-            </w:pPr>
-            <w:r>
-              <w:rPr>
-                <w:rFonts w:ascii="Times New Roman" w:hAnsi="Times New Roman" w:cs="Times New Roman"/>
-                <w:b/>
-                <w:bCs/>
-                <w:sz w:val="24"/>
-                <w:szCs w:val="24"/>
-                <w:lang w:val="en-US"/>
-              </w:rPr>
-              <w:t>SecRisk #</w:t>
-            </w:r>
-            <w:r>
-              <w:rPr>
-                <w:rFonts w:ascii="Times New Roman" w:hAnsi="Times New Roman" w:cs="Times New Roman"/>
-                <w:b/>
-                <w:bCs/>
-                <w:sz w:val="24"/>
-                <w:szCs w:val="24"/>
-                <w:lang w:val="en-US"/>
-              </w:rPr>
               <w:t xml:space="preserve"> / Justification</w:t>
             </w:r>
           </w:p>
@@ -17040,6 +17352,7 @@
         <w:tc>
           <w:tcPr>
             <w:tcW w:type="dxa" w:w="2875"/>
+            <w:shd w:fill="F2F2F2" w:val="clear"/>
           </w:tcPr>
           <w:p>
             <w:r>
@@ -17050,6 +17363,7 @@
         <w:tc>
           <w:tcPr>
             <w:tcW w:type="dxa" w:w="3440"/>
+            <w:shd w:fill="F2F2F2" w:val="clear"/>
           </w:tcPr>
           <w:p>
             <w:r>
@@ -17060,6 +17374,7 @@
         <w:tc>
           <w:tcPr>
             <w:tcW w:type="dxa" w:w="3175"/>
+            <w:shd w:fill="F2F2F2" w:val="clear"/>
           </w:tcPr>
           <w:p>
             <w:r>
@@ -17104,6 +17419,7 @@
         <w:tc>
           <w:tcPr>
             <w:tcW w:type="dxa" w:w="2875"/>
+            <w:shd w:fill="F2F2F2" w:val="clear"/>
           </w:tcPr>
           <w:p>
             <w:r>
@@ -17114,6 +17430,7 @@
         <w:tc>
           <w:tcPr>
             <w:tcW w:type="dxa" w:w="3440"/>
+            <w:shd w:fill="F2F2F2" w:val="clear"/>
           </w:tcPr>
           <w:p>
             <w:r>
@@ -17124,6 +17441,7 @@
         <w:tc>
           <w:tcPr>
             <w:tcW w:type="dxa" w:w="3175"/>
+            <w:shd w:fill="F2F2F2" w:val="clear"/>
           </w:tcPr>
           <w:p>
             <w:r>
@@ -17569,6 +17887,7 @@
           <w:tcPr>
             <w:cnfStyle w:val="001000000000" w:firstRow="0" w:lastRow="0" w:firstColumn="1" w:lastColumn="0" w:oddVBand="0" w:evenVBand="0" w:oddHBand="0" w:evenHBand="0" w:firstRowFirstColumn="0" w:firstRowLastColumn="0" w:lastRowFirstColumn="0" w:lastRowLastColumn="0"/>
             <w:tcW w:w="1978" w:type="dxa"/>
+            <w:shd w:fill="AEAAAA" w:val="clear"/>
           </w:tcPr>
           <w:p>
             <w:pPr>
@@ -17583,6 +17902,8 @@
             <w:r>
               <w:rPr>
                 <w:rFonts w:ascii="Times New Roman" w:hAnsi="Times New Roman" w:cs="Times New Roman"/>
+                <w:b/>
+                <w:color w:val="FFFFFF"/>
                 <w:sz w:val="24"/>
                 <w:szCs w:val="24"/>
                 <w:lang w:val="en-US"/>
@@ -17594,6 +17915,7 @@
         <w:tc>
           <w:tcPr>
             <w:tcW w:w="4241" w:type="dxa"/>
+            <w:shd w:fill="AEAAAA" w:val="clear"/>
           </w:tcPr>
           <w:p>
             <w:pPr>
@@ -17609,6 +17931,8 @@
             <w:r>
               <w:rPr>
                 <w:rFonts w:ascii="Times New Roman" w:hAnsi="Times New Roman" w:cs="Times New Roman"/>
+                <w:b/>
+                <w:color w:val="FFFFFF"/>
                 <w:sz w:val="24"/>
                 <w:szCs w:val="24"/>
                 <w:lang w:val="en-US"/>
@@ -17620,6 +17944,7 @@
         <w:tc>
           <w:tcPr>
             <w:tcW w:w="3126" w:type="dxa"/>
+            <w:shd w:fill="AEAAAA" w:val="clear"/>
           </w:tcPr>
           <w:p>
             <w:pPr>
@@ -17635,6 +17960,8 @@
             <w:r>
               <w:rPr>
                 <w:rFonts w:ascii="Times New Roman" w:hAnsi="Times New Roman" w:cs="Times New Roman"/>
+                <w:b/>
+                <w:color w:val="FFFFFF"/>
                 <w:sz w:val="24"/>
                 <w:szCs w:val="24"/>
                 <w:lang w:val="en-US"/>
@@ -17680,6 +18007,7 @@
         <w:tc>
           <w:tcPr>
             <w:tcW w:type="dxa" w:w="2008"/>
+            <w:shd w:fill="F2F2F2" w:val="clear"/>
           </w:tcPr>
           <w:p>
             <w:r>
@@ -17690,6 +18018,7 @@
         <w:tc>
           <w:tcPr>
             <w:tcW w:type="dxa" w:w="4307"/>
+            <w:shd w:fill="F2F2F2" w:val="clear"/>
           </w:tcPr>
           <w:p>
             <w:r>
@@ -17700,6 +18029,7 @@
         <w:tc>
           <w:tcPr>
             <w:tcW w:type="dxa" w:w="3175"/>
+            <w:shd w:fill="F2F2F2" w:val="clear"/>
           </w:tcPr>
           <w:p>
             <w:r>
@@ -17744,6 +18074,7 @@
         <w:tc>
           <w:tcPr>
             <w:tcW w:type="dxa" w:w="2008"/>
+            <w:shd w:fill="F2F2F2" w:val="clear"/>
           </w:tcPr>
           <w:p>
             <w:r>
@@ -17754,6 +18085,7 @@
         <w:tc>
           <w:tcPr>
             <w:tcW w:type="dxa" w:w="4307"/>
+            <w:shd w:fill="F2F2F2" w:val="clear"/>
           </w:tcPr>
           <w:p>
             <w:r>
@@ -17764,6 +18096,7 @@
         <w:tc>
           <w:tcPr>
             <w:tcW w:type="dxa" w:w="3175"/>
+            <w:shd w:fill="F2F2F2" w:val="clear"/>
           </w:tcPr>
           <w:p>
             <w:r>
@@ -17808,6 +18141,7 @@
         <w:tc>
           <w:tcPr>
             <w:tcW w:type="dxa" w:w="2008"/>
+            <w:shd w:fill="F2F2F2" w:val="clear"/>
           </w:tcPr>
           <w:p>
             <w:r>
@@ -17818,6 +18152,7 @@
         <w:tc>
           <w:tcPr>
             <w:tcW w:type="dxa" w:w="4307"/>
+            <w:shd w:fill="F2F2F2" w:val="clear"/>
           </w:tcPr>
           <w:p>
             <w:r>
@@ -17828,6 +18163,7 @@
         <w:tc>
           <w:tcPr>
             <w:tcW w:type="dxa" w:w="3175"/>
+            <w:shd w:fill="F2F2F2" w:val="clear"/>
           </w:tcPr>
           <w:p>
             <w:r>
@@ -17872,6 +18208,7 @@
         <w:tc>
           <w:tcPr>
             <w:tcW w:type="dxa" w:w="2008"/>
+            <w:shd w:fill="F2F2F2" w:val="clear"/>
           </w:tcPr>
           <w:p>
             <w:r>
@@ -17882,6 +18219,7 @@
         <w:tc>
           <w:tcPr>
             <w:tcW w:type="dxa" w:w="4307"/>
+            <w:shd w:fill="F2F2F2" w:val="clear"/>
           </w:tcPr>
           <w:p>
             <w:r>
@@ -17892,6 +18230,7 @@
         <w:tc>
           <w:tcPr>
             <w:tcW w:type="dxa" w:w="3175"/>
+            <w:shd w:fill="F2F2F2" w:val="clear"/>
           </w:tcPr>
           <w:p>
             <w:r>
@@ -19367,6 +19706,7 @@
         <w:tc>
           <w:tcPr>
             <w:tcW w:w="2263" w:type="dxa"/>
+            <w:shd w:fill="AEAAAA" w:val="clear"/>
           </w:tcPr>
           <w:p>
             <w:pPr>
@@ -19386,7 +19726,8 @@
             <w:r>
               <w:rPr>
                 <w:rFonts w:ascii="Times New Roman" w:hAnsi="Times New Roman" w:cs="Times New Roman"/>
-                <w:color w:val="000000" w:themeColor="text1"/>
+                <w:b/>
+                <w:color w:val="FFFFFF"/>
                 <w:sz w:val="24"/>
                 <w:szCs w:val="24"/>
                 <w:lang w:val="en-US"/>
@@ -19400,6 +19741,7 @@
             <w:tcW w:w="4253" w:type="dxa"/>
             <w:noWrap/>
             <w:hideMark/>
+            <w:shd w:fill="AEAAAA" w:val="clear"/>
           </w:tcPr>
           <w:p>
             <w:pPr>
@@ -19419,7 +19761,8 @@
             <w:r>
               <w:rPr>
                 <w:rFonts w:ascii="Times New Roman" w:eastAsia="Times New Roman" w:hAnsi="Times New Roman" w:cs="Times New Roman"/>
-                <w:color w:val="000000" w:themeColor="text1"/>
+                <w:b/>
+                <w:color w:val="FFFFFF"/>
                 <w:sz w:val="24"/>
                 <w:szCs w:val="24"/>
                 <w:lang w:val="en-US"/>
@@ -19433,6 +19776,7 @@
             <w:tcW w:w="2977" w:type="dxa"/>
             <w:noWrap/>
             <w:hideMark/>
+            <w:shd w:fill="AEAAAA" w:val="clear"/>
           </w:tcPr>
           <w:p>
             <w:pPr>
@@ -19448,7 +19792,8 @@
             <w:r>
               <w:rPr>
                 <w:rFonts w:ascii="Times New Roman" w:eastAsia="Times New Roman" w:hAnsi="Times New Roman" w:cs="Times New Roman"/>
-                <w:color w:val="000000" w:themeColor="text1"/>
+                <w:b/>
+                <w:color w:val="FFFFFF"/>
                 <w:sz w:val="24"/>
                 <w:szCs w:val="24"/>
                 <w:lang w:val="en-US"/>
@@ -19494,6 +19839,7 @@
         <w:tc>
           <w:tcPr>
             <w:tcW w:type="dxa" w:w="2263"/>
+            <w:shd w:fill="F2F2F2" w:val="clear"/>
           </w:tcPr>
           <w:p>
             <w:r>
@@ -19504,6 +19850,7 @@
         <w:tc>
           <w:tcPr>
             <w:tcW w:type="dxa" w:w="4253"/>
+            <w:shd w:fill="F2F2F2" w:val="clear"/>
           </w:tcPr>
           <w:p>
             <w:r>
@@ -19514,6 +19861,7 @@
         <w:tc>
           <w:tcPr>
             <w:tcW w:type="dxa" w:w="2977"/>
+            <w:shd w:fill="F2F2F2" w:val="clear"/>
           </w:tcPr>
           <w:p>
             <w:r>
@@ -19558,6 +19906,7 @@
         <w:tc>
           <w:tcPr>
             <w:tcW w:type="dxa" w:w="2263"/>
+            <w:shd w:fill="F2F2F2" w:val="clear"/>
           </w:tcPr>
           <w:p>
             <w:r>
@@ -19568,6 +19917,7 @@
         <w:tc>
           <w:tcPr>
             <w:tcW w:type="dxa" w:w="4253"/>
+            <w:shd w:fill="F2F2F2" w:val="clear"/>
           </w:tcPr>
           <w:p>
             <w:r>
@@ -19578,6 +19928,7 @@
         <w:tc>
           <w:tcPr>
             <w:tcW w:type="dxa" w:w="2977"/>
+            <w:shd w:fill="F2F2F2" w:val="clear"/>
           </w:tcPr>
           <w:p>
             <w:r>
@@ -19622,6 +19973,7 @@
         <w:tc>
           <w:tcPr>
             <w:tcW w:type="dxa" w:w="2263"/>
+            <w:shd w:fill="F2F2F2" w:val="clear"/>
           </w:tcPr>
           <w:p>
             <w:r>
@@ -19632,6 +19984,7 @@
         <w:tc>
           <w:tcPr>
             <w:tcW w:type="dxa" w:w="4253"/>
+            <w:shd w:fill="F2F2F2" w:val="clear"/>
           </w:tcPr>
           <w:p>
             <w:r>
@@ -19642,6 +19995,7 @@
         <w:tc>
           <w:tcPr>
             <w:tcW w:type="dxa" w:w="2977"/>
+            <w:shd w:fill="F2F2F2" w:val="clear"/>
           </w:tcPr>
           <w:p>
             <w:r>
@@ -19767,6 +20121,7 @@
             <w:tcW w:w="1416" w:type="dxa"/>
             <w:noWrap/>
             <w:hideMark/>
+            <w:shd w:fill="AEAAAA" w:val="clear"/>
           </w:tcPr>
           <w:p>
             <w:pPr>
@@ -19782,7 +20137,8 @@
             <w:r>
               <w:rPr>
                 <w:rFonts w:ascii="Times New Roman" w:eastAsia="Times New Roman" w:hAnsi="Times New Roman" w:cs="Times New Roman"/>
-                <w:color w:val="auto"/>
+                <w:b/>
+                <w:color w:val="FFFFFF"/>
                 <w:sz w:val="24"/>
                 <w:szCs w:val="24"/>
                 <w:lang w:val="en-US"/>
@@ -19796,6 +20152,7 @@
             <w:tcW w:w="2265" w:type="dxa"/>
             <w:noWrap/>
             <w:hideMark/>
+            <w:shd w:fill="AEAAAA" w:val="clear"/>
           </w:tcPr>
           <w:p>
             <w:pPr>
@@ -19811,7 +20168,8 @@
             <w:r>
               <w:rPr>
                 <w:rFonts w:ascii="Times New Roman" w:eastAsia="Times New Roman" w:hAnsi="Times New Roman" w:cs="Times New Roman"/>
-                <w:color w:val="auto"/>
+                <w:b/>
+                <w:color w:val="FFFFFF"/>
                 <w:sz w:val="24"/>
                 <w:szCs w:val="24"/>
                 <w:lang w:val="en-US"/>
@@ -19825,6 +20183,7 @@
             <w:tcW w:w="1843" w:type="dxa"/>
             <w:noWrap/>
             <w:hideMark/>
+            <w:shd w:fill="AEAAAA" w:val="clear"/>
           </w:tcPr>
           <w:p>
             <w:pPr>
@@ -19840,7 +20199,8 @@
             <w:r>
               <w:rPr>
                 <w:rFonts w:ascii="Times New Roman" w:eastAsia="Times New Roman" w:hAnsi="Times New Roman" w:cs="Times New Roman"/>
-                <w:color w:val="auto"/>
+                <w:b/>
+                <w:color w:val="FFFFFF"/>
                 <w:sz w:val="24"/>
                 <w:szCs w:val="24"/>
                 <w:lang w:val="en-US"/>
@@ -19854,6 +20214,7 @@
             <w:tcW w:w="3969" w:type="dxa"/>
             <w:noWrap/>
             <w:hideMark/>
+            <w:shd w:fill="AEAAAA" w:val="clear"/>
           </w:tcPr>
           <w:p>
             <w:pPr>
@@ -19869,7 +20230,8 @@
             <w:r>
               <w:rPr>
                 <w:rFonts w:ascii="Times New Roman" w:eastAsia="Times New Roman" w:hAnsi="Times New Roman" w:cs="Times New Roman"/>
-                <w:color w:val="auto"/>
+                <w:b/>
+                <w:color w:val="FFFFFF"/>
                 <w:sz w:val="24"/>
                 <w:szCs w:val="24"/>
                 <w:lang w:val="en-US"/>
@@ -19925,6 +20287,7 @@
         <w:tc>
           <w:tcPr>
             <w:tcW w:type="dxa" w:w="1416"/>
+            <w:shd w:fill="F2F2F2" w:val="clear"/>
           </w:tcPr>
           <w:p>
             <w:r>
@@ -19935,6 +20298,7 @@
         <w:tc>
           <w:tcPr>
             <w:tcW w:type="dxa" w:w="2265"/>
+            <w:shd w:fill="F2F2F2" w:val="clear"/>
           </w:tcPr>
           <w:p>
             <w:r>
@@ -19945,6 +20309,7 @@
         <w:tc>
           <w:tcPr>
             <w:tcW w:type="dxa" w:w="1843"/>
+            <w:shd w:fill="F2F2F2" w:val="clear"/>
           </w:tcPr>
           <w:p>
             <w:r>
@@ -19955,6 +20320,7 @@
         <w:tc>
           <w:tcPr>
             <w:tcW w:type="dxa" w:w="3969"/>
+            <w:shd w:fill="F2F2F2" w:val="clear"/>
           </w:tcPr>
           <w:p>
             <w:r>
@@ -20009,6 +20375,7 @@
         <w:tc>
           <w:tcPr>
             <w:tcW w:type="dxa" w:w="1416"/>
+            <w:shd w:fill="F2F2F2" w:val="clear"/>
           </w:tcPr>
           <w:p>
             <w:r>
@@ -20019,6 +20386,7 @@
         <w:tc>
           <w:tcPr>
             <w:tcW w:type="dxa" w:w="2265"/>
+            <w:shd w:fill="F2F2F2" w:val="clear"/>
           </w:tcPr>
           <w:p>
             <w:r>
@@ -20029,6 +20397,7 @@
         <w:tc>
           <w:tcPr>
             <w:tcW w:type="dxa" w:w="1843"/>
+            <w:shd w:fill="F2F2F2" w:val="clear"/>
           </w:tcPr>
           <w:p>
             <w:r>
@@ -20039,6 +20408,7 @@
         <w:tc>
           <w:tcPr>
             <w:tcW w:type="dxa" w:w="3969"/>
+            <w:shd w:fill="F2F2F2" w:val="clear"/>
           </w:tcPr>
           <w:p>
             <w:r>
@@ -20093,6 +20463,7 @@
         <w:tc>
           <w:tcPr>
             <w:tcW w:type="dxa" w:w="1416"/>
+            <w:shd w:fill="F2F2F2" w:val="clear"/>
           </w:tcPr>
           <w:p>
             <w:r>
@@ -20103,6 +20474,7 @@
         <w:tc>
           <w:tcPr>
             <w:tcW w:type="dxa" w:w="2265"/>
+            <w:shd w:fill="F2F2F2" w:val="clear"/>
           </w:tcPr>
           <w:p>
             <w:r>
@@ -20113,6 +20485,7 @@
         <w:tc>
           <w:tcPr>
             <w:tcW w:type="dxa" w:w="1843"/>
+            <w:shd w:fill="F2F2F2" w:val="clear"/>
           </w:tcPr>
           <w:p>
             <w:r>
@@ -20123,6 +20496,7 @@
         <w:tc>
           <w:tcPr>
             <w:tcW w:type="dxa" w:w="3969"/>
+            <w:shd w:fill="F2F2F2" w:val="clear"/>
           </w:tcPr>
           <w:p>
             <w:r>
@@ -20177,6 +20551,7 @@
         <w:tc>
           <w:tcPr>
             <w:tcW w:type="dxa" w:w="1416"/>
+            <w:shd w:fill="F2F2F2" w:val="clear"/>
           </w:tcPr>
           <w:p>
             <w:r>
@@ -20187,6 +20562,7 @@
         <w:tc>
           <w:tcPr>
             <w:tcW w:type="dxa" w:w="2265"/>
+            <w:shd w:fill="F2F2F2" w:val="clear"/>
           </w:tcPr>
           <w:p>
             <w:r>
@@ -20197,6 +20573,7 @@
         <w:tc>
           <w:tcPr>
             <w:tcW w:type="dxa" w:w="1843"/>
+            <w:shd w:fill="F2F2F2" w:val="clear"/>
           </w:tcPr>
           <w:p>
             <w:r>
@@ -20207,6 +20584,7 @@
         <w:tc>
           <w:tcPr>
             <w:tcW w:type="dxa" w:w="3969"/>
+            <w:shd w:fill="F2F2F2" w:val="clear"/>
           </w:tcPr>
           <w:p>
             <w:r>
@@ -20261,6 +20639,7 @@
         <w:tc>
           <w:tcPr>
             <w:tcW w:type="dxa" w:w="1416"/>
+            <w:shd w:fill="F2F2F2" w:val="clear"/>
           </w:tcPr>
           <w:p>
             <w:r>
@@ -20271,6 +20650,7 @@
         <w:tc>
           <w:tcPr>
             <w:tcW w:type="dxa" w:w="2265"/>
+            <w:shd w:fill="F2F2F2" w:val="clear"/>
           </w:tcPr>
           <w:p>
             <w:r>
@@ -20281,6 +20661,7 @@
         <w:tc>
           <w:tcPr>
             <w:tcW w:type="dxa" w:w="1843"/>
+            <w:shd w:fill="F2F2F2" w:val="clear"/>
           </w:tcPr>
           <w:p>
             <w:r>
@@ -20291,6 +20672,7 @@
         <w:tc>
           <w:tcPr>
             <w:tcW w:type="dxa" w:w="3969"/>
+            <w:shd w:fill="F2F2F2" w:val="clear"/>
           </w:tcPr>
           <w:p>
             <w:r>
@@ -20995,7 +21377,7 @@
         <w:tc>
           <w:tcPr>
             <w:tcW w:w="516" w:type="dxa"/>
-            <w:shd w:val="clear" w:color="auto" w:fill="A6A6A6" w:themeFill="background1" w:themeFillShade="A6"/>
+            <w:shd w:fill="AEAAAA" w:val="clear"/>
           </w:tcPr>
           <w:p>
             <w:pPr>
@@ -21016,7 +21398,7 @@
                 <w:rFonts w:ascii="Times New Roman" w:hAnsi="Times New Roman" w:cs="Times New Roman"/>
                 <w:b/>
                 <w:bCs/>
-                <w:color w:val="auto"/>
+                <w:color w:val="FFFFFF"/>
                 <w:sz w:val="24"/>
                 <w:szCs w:val="24"/>
                 <w:lang w:val="en-US"/>
@@ -21028,7 +21410,7 @@
         <w:tc>
           <w:tcPr>
             <w:tcW w:w="1750" w:type="dxa"/>
-            <w:shd w:val="clear" w:color="auto" w:fill="A6A6A6" w:themeFill="background1" w:themeFillShade="A6"/>
+            <w:shd w:fill="AEAAAA" w:val="clear"/>
           </w:tcPr>
           <w:p>
             <w:pPr>
@@ -21048,7 +21430,7 @@
                 <w:rFonts w:ascii="Times New Roman" w:hAnsi="Times New Roman" w:cs="Times New Roman"/>
                 <w:b/>
                 <w:bCs/>
-                <w:color w:val="auto"/>
+                <w:color w:val="FFFFFF"/>
                 <w:sz w:val="24"/>
                 <w:szCs w:val="24"/>
                 <w:lang w:val="en-US"/>
@@ -21060,7 +21442,7 @@
         <w:tc>
           <w:tcPr>
             <w:tcW w:w="1802" w:type="dxa"/>
-            <w:shd w:val="clear" w:color="auto" w:fill="A6A6A6" w:themeFill="background1" w:themeFillShade="A6"/>
+            <w:shd w:fill="AEAAAA" w:val="clear"/>
           </w:tcPr>
           <w:p>
             <w:pPr>
@@ -21080,7 +21462,7 @@
                 <w:rFonts w:ascii="Times New Roman" w:hAnsi="Times New Roman" w:cs="Times New Roman"/>
                 <w:b/>
                 <w:bCs/>
-                <w:color w:val="auto"/>
+                <w:color w:val="FFFFFF"/>
                 <w:sz w:val="24"/>
                 <w:szCs w:val="24"/>
                 <w:lang w:val="en-US"/>
@@ -21092,7 +21474,7 @@
         <w:tc>
           <w:tcPr>
             <w:tcW w:w="1928" w:type="dxa"/>
-            <w:shd w:val="clear" w:color="auto" w:fill="A6A6A6" w:themeFill="background1" w:themeFillShade="A6"/>
+            <w:shd w:fill="AEAAAA" w:val="clear"/>
           </w:tcPr>
           <w:p>
             <w:pPr>
@@ -21112,7 +21494,7 @@
                 <w:rFonts w:ascii="Times New Roman" w:hAnsi="Times New Roman" w:cs="Times New Roman"/>
                 <w:b/>
                 <w:bCs/>
-                <w:color w:val="auto"/>
+                <w:color w:val="FFFFFF"/>
                 <w:sz w:val="24"/>
                 <w:szCs w:val="24"/>
                 <w:lang w:val="en-US"/>
@@ -21124,7 +21506,7 @@
         <w:tc>
           <w:tcPr>
             <w:tcW w:w="1443" w:type="dxa"/>
-            <w:shd w:val="clear" w:color="auto" w:fill="A6A6A6" w:themeFill="background1" w:themeFillShade="A6"/>
+            <w:shd w:fill="AEAAAA" w:val="clear"/>
           </w:tcPr>
           <w:p>
             <w:pPr>
@@ -21145,7 +21527,7 @@
                 <w:rFonts w:ascii="Times New Roman" w:hAnsi="Times New Roman" w:cs="Times New Roman"/>
                 <w:b/>
                 <w:bCs/>
-                <w:color w:val="auto"/>
+                <w:color w:val="FFFFFF"/>
                 <w:sz w:val="24"/>
                 <w:szCs w:val="24"/>
                 <w:lang w:val="en-US"/>
@@ -21157,7 +21539,7 @@
         <w:tc>
           <w:tcPr>
             <w:tcW w:w="1839" w:type="dxa"/>
-            <w:shd w:val="clear" w:color="auto" w:fill="A6A6A6" w:themeFill="background1" w:themeFillShade="A6"/>
+            <w:shd w:fill="AEAAAA" w:val="clear"/>
           </w:tcPr>
           <w:p>
             <w:pPr>
@@ -21177,7 +21559,7 @@
                 <w:rFonts w:ascii="Times New Roman" w:hAnsi="Times New Roman" w:cs="Times New Roman"/>
                 <w:b/>
                 <w:bCs/>
-                <w:color w:val="auto"/>
+                <w:color w:val="FFFFFF"/>
                 <w:sz w:val="24"/>
                 <w:szCs w:val="24"/>
                 <w:lang w:val="en-US"/>
@@ -21253,6 +21635,7 @@
         <w:tc>
           <w:tcPr>
             <w:tcW w:type="dxa" w:w="528"/>
+            <w:shd w:fill="F2F2F2" w:val="clear"/>
           </w:tcPr>
           <w:p>
             <w:r>
@@ -21263,6 +21646,7 @@
         <w:tc>
           <w:tcPr>
             <w:tcW w:type="dxa" w:w="1790"/>
+            <w:shd w:fill="F2F2F2" w:val="clear"/>
           </w:tcPr>
           <w:p>
             <w:r>
@@ -21273,6 +21657,7 @@
         <w:tc>
           <w:tcPr>
             <w:tcW w:type="dxa" w:w="1843"/>
+            <w:shd w:fill="F2F2F2" w:val="clear"/>
           </w:tcPr>
           <w:p>
             <w:r>
@@ -21283,6 +21668,7 @@
         <w:tc>
           <w:tcPr>
             <w:tcW w:type="dxa" w:w="1972"/>
+            <w:shd w:fill="F2F2F2" w:val="clear"/>
           </w:tcPr>
           <w:p>
             <w:r>
@@ -21293,6 +21679,7 @@
         <w:tc>
           <w:tcPr>
             <w:tcW w:type="dxa" w:w="1476"/>
+            <w:shd w:fill="F2F2F2" w:val="clear"/>
           </w:tcPr>
           <w:p>
             <w:r>
@@ -21303,6 +21690,7 @@
         <w:tc>
           <w:tcPr>
             <w:tcW w:type="dxa" w:w="1881"/>
+            <w:shd w:fill="F2F2F2" w:val="clear"/>
           </w:tcPr>
           <w:p>
             <w:r>
@@ -21377,6 +21765,7 @@
         <w:tc>
           <w:tcPr>
             <w:tcW w:type="dxa" w:w="528"/>
+            <w:shd w:fill="F2F2F2" w:val="clear"/>
           </w:tcPr>
           <w:p>
             <w:r>
@@ -21387,6 +21776,7 @@
         <w:tc>
           <w:tcPr>
             <w:tcW w:type="dxa" w:w="1790"/>
+            <w:shd w:fill="F2F2F2" w:val="clear"/>
           </w:tcPr>
           <w:p>
             <w:r>
@@ -21397,6 +21787,7 @@
         <w:tc>
           <w:tcPr>
             <w:tcW w:type="dxa" w:w="1843"/>
+            <w:shd w:fill="F2F2F2" w:val="clear"/>
           </w:tcPr>
           <w:p>
             <w:r>
@@ -21407,6 +21798,7 @@
         <w:tc>
           <w:tcPr>
             <w:tcW w:type="dxa" w:w="1972"/>
+            <w:shd w:fill="F2F2F2" w:val="clear"/>
           </w:tcPr>
           <w:p>
             <w:r>
@@ -21417,6 +21809,7 @@
         <w:tc>
           <w:tcPr>
             <w:tcW w:type="dxa" w:w="1476"/>
+            <w:shd w:fill="F2F2F2" w:val="clear"/>
           </w:tcPr>
           <w:p>
             <w:r>
@@ -21427,6 +21820,7 @@
         <w:tc>
           <w:tcPr>
             <w:tcW w:type="dxa" w:w="1881"/>
+            <w:shd w:fill="F2F2F2" w:val="clear"/>
           </w:tcPr>
           <w:p>
             <w:r>
@@ -21501,6 +21895,7 @@
         <w:tc>
           <w:tcPr>
             <w:tcW w:type="dxa" w:w="528"/>
+            <w:shd w:fill="F2F2F2" w:val="clear"/>
           </w:tcPr>
           <w:p>
             <w:r>
@@ -21511,6 +21906,7 @@
         <w:tc>
           <w:tcPr>
             <w:tcW w:type="dxa" w:w="1790"/>
+            <w:shd w:fill="F2F2F2" w:val="clear"/>
           </w:tcPr>
           <w:p>
             <w:r>
@@ -21521,6 +21917,7 @@
         <w:tc>
           <w:tcPr>
             <w:tcW w:type="dxa" w:w="1843"/>
+            <w:shd w:fill="F2F2F2" w:val="clear"/>
           </w:tcPr>
           <w:p>
             <w:r>
@@ -21531,6 +21928,7 @@
         <w:tc>
           <w:tcPr>
             <w:tcW w:type="dxa" w:w="1972"/>
+            <w:shd w:fill="F2F2F2" w:val="clear"/>
           </w:tcPr>
           <w:p>
             <w:r>
@@ -21541,6 +21939,7 @@
         <w:tc>
           <w:tcPr>
             <w:tcW w:type="dxa" w:w="1476"/>
+            <w:shd w:fill="F2F2F2" w:val="clear"/>
           </w:tcPr>
           <w:p>
             <w:r>
@@ -21551,6 +21950,7 @@
         <w:tc>
           <w:tcPr>
             <w:tcW w:type="dxa" w:w="1881"/>
+            <w:shd w:fill="F2F2F2" w:val="clear"/>
           </w:tcPr>
           <w:p>
             <w:r>
@@ -21696,6 +22096,7 @@
           <w:tcPr>
             <w:cnfStyle w:val="001000000000" w:firstRow="0" w:lastRow="0" w:firstColumn="1" w:lastColumn="0" w:oddVBand="0" w:evenVBand="0" w:oddHBand="0" w:evenHBand="0" w:firstRowFirstColumn="0" w:firstRowLastColumn="0" w:lastRowFirstColumn="0" w:lastRowLastColumn="0"/>
             <w:tcW w:w="1978" w:type="dxa"/>
+            <w:shd w:fill="AEAAAA" w:val="clear"/>
           </w:tcPr>
           <w:p>
             <w:pPr>
@@ -21710,6 +22111,8 @@
             <w:r>
               <w:rPr>
                 <w:rFonts w:ascii="Times New Roman" w:hAnsi="Times New Roman" w:cs="Times New Roman"/>
+                <w:b/>
+                <w:color w:val="FFFFFF"/>
                 <w:sz w:val="24"/>
                 <w:szCs w:val="24"/>
                 <w:lang w:val="en-US"/>
@@ -21721,6 +22124,7 @@
         <w:tc>
           <w:tcPr>
             <w:tcW w:w="4242" w:type="dxa"/>
+            <w:shd w:fill="AEAAAA" w:val="clear"/>
           </w:tcPr>
           <w:p>
             <w:pPr>
@@ -21736,6 +22140,8 @@
             <w:r>
               <w:rPr>
                 <w:rFonts w:ascii="Times New Roman" w:hAnsi="Times New Roman" w:cs="Times New Roman"/>
+                <w:b/>
+                <w:color w:val="FFFFFF"/>
                 <w:sz w:val="24"/>
                 <w:szCs w:val="24"/>
                 <w:lang w:val="en-US"/>
@@ -21747,6 +22153,7 @@
         <w:tc>
           <w:tcPr>
             <w:tcW w:w="3125" w:type="dxa"/>
+            <w:shd w:fill="AEAAAA" w:val="clear"/>
           </w:tcPr>
           <w:p>
             <w:pPr>
@@ -21760,6 +22167,10 @@
               </w:rPr>
             </w:pPr>
             <w:r>
+              <w:rPr>
+                <w:b/>
+                <w:color w:val="FFFFFF"/>
+              </w:rPr>
               <w:t>Address Verification</w:t>
             </w:r>
           </w:p>
@@ -21801,6 +22212,7 @@
         <w:tc>
           <w:tcPr>
             <w:tcW w:type="dxa" w:w="2009"/>
+            <w:shd w:fill="F2F2F2" w:val="clear"/>
           </w:tcPr>
           <w:p>
             <w:r>
@@ -21811,6 +22223,7 @@
         <w:tc>
           <w:tcPr>
             <w:tcW w:type="dxa" w:w="4308"/>
+            <w:shd w:fill="F2F2F2" w:val="clear"/>
           </w:tcPr>
           <w:p>
             <w:r>
@@ -21821,6 +22234,7 @@
         <w:tc>
           <w:tcPr>
             <w:tcW w:type="dxa" w:w="3173"/>
+            <w:shd w:fill="F2F2F2" w:val="clear"/>
           </w:tcPr>
           <w:p>
             <w:r>
@@ -21865,6 +22279,7 @@
         <w:tc>
           <w:tcPr>
             <w:tcW w:type="dxa" w:w="2009"/>
+            <w:shd w:fill="F2F2F2" w:val="clear"/>
           </w:tcPr>
           <w:p>
             <w:r>
@@ -21875,6 +22290,7 @@
         <w:tc>
           <w:tcPr>
             <w:tcW w:type="dxa" w:w="4308"/>
+            <w:shd w:fill="F2F2F2" w:val="clear"/>
           </w:tcPr>
           <w:p>
             <w:r>
@@ -21885,6 +22301,7 @@
         <w:tc>
           <w:tcPr>
             <w:tcW w:type="dxa" w:w="3173"/>
+            <w:shd w:fill="F2F2F2" w:val="clear"/>
           </w:tcPr>
           <w:p>
             <w:r>

</xml_diff>

<commit_message>
docs: Replace all template diagrams with NPSP-specific ones
- Figure 1: NPSP Data Model ERD (16 entities with relationships)
- Figure 2: Macro-Process flowchart (donation processing, 12 steps)
- Figure 3: Gift Entry Sub-Process (BDI/GE flow with decisions)

Co-Authored-By: Erik Rozi <erik.rozi@cognition.ai>
</commit_message>
<xml_diff>
--- a/documentation/NPSP_Technical_Design_Document_2025-05-14.docx
+++ b/documentation/NPSP_Technical_Design_Document_2025-05-14.docx
@@ -8395,64 +8395,39 @@
       <w:pPr>
         <w:keepNext/>
         <w:spacing w:before="120" w:line="276" w:lineRule="auto"/>
-        <w:rPr>
-          <w:rFonts w:ascii="Times New Roman" w:hAnsi="Times New Roman" w:cs="Times New Roman"/>
-          <w:lang w:val="en-US"/>
-        </w:rPr>
-      </w:pPr>
-      <w:r>
-        <w:rPr>
-          <w:rFonts w:ascii="Times New Roman" w:hAnsi="Times New Roman" w:cs="Times New Roman"/>
-          <w:noProof/>
-          <w:sz w:val="24"/>
-          <w:szCs w:val="24"/>
-          <w:lang w:val="en-US" w:eastAsia="en-US"/>
-        </w:rPr>
+        <w:jc w:val="center"/>
+        <w:rPr>
+          <w:rFonts w:ascii="Times New Roman" w:hAnsi="Times New Roman" w:cs="Times New Roman"/>
+          <w:lang w:val="en-US"/>
+        </w:rPr>
+      </w:pPr>
+      <w:r>
         <w:drawing>
-          <wp:inline distT="0" distB="0" distL="0" distR="0" wp14:anchorId="7331EF97" wp14:editId="38D0F23F">
-            <wp:extent cx="5939782" cy="4216400"/>
-            <wp:effectExtent l="0" t="0" r="4445" b="0"/>
-            <wp:docPr id="8" name="Picture 1"/>
+          <wp:inline xmlns:a="http://schemas.openxmlformats.org/drawingml/2006/main" xmlns:pic="http://schemas.openxmlformats.org/drawingml/2006/picture">
+            <wp:extent cx="5486400" cy="4315442"/>
+            <wp:docPr id="18" name="Picture 18"/>
             <wp:cNvGraphicFramePr>
-              <a:graphicFrameLocks xmlns:a="http://schemas.openxmlformats.org/drawingml/2006/main" noChangeAspect="1"/>
+              <a:graphicFrameLocks noChangeAspect="1"/>
             </wp:cNvGraphicFramePr>
-            <a:graphic xmlns:a="http://schemas.openxmlformats.org/drawingml/2006/main">
+            <a:graphic>
               <a:graphicData uri="http://schemas.openxmlformats.org/drawingml/2006/picture">
-                <pic:pic xmlns:pic="http://schemas.openxmlformats.org/drawingml/2006/picture">
+                <pic:pic>
                   <pic:nvPicPr>
-                    <pic:cNvPr id="0" name="Picture 1"/>
-                    <pic:cNvPicPr>
-                      <a:picLocks noChangeAspect="1" noChangeArrowheads="1"/>
-                    </pic:cNvPicPr>
+                    <pic:cNvPr id="0" name="npsp_data_model.png"/>
+                    <pic:cNvPicPr/>
                   </pic:nvPicPr>
-                  <pic:blipFill rotWithShape="1">
-                    <a:blip r:embed="rId12">
-                      <a:extLst>
-                        <a:ext uri="{28A0092B-C50C-407E-A947-70E740481C1C}">
-                          <a14:useLocalDpi xmlns:a14="http://schemas.microsoft.com/office/drawing/2010/main" val="0"/>
-                        </a:ext>
-                      </a:extLst>
-                    </a:blip>
-                    <a:srcRect b="3432"/>
-                    <a:stretch/>
+                  <pic:blipFill>
+                    <a:blip r:embed="rId22"/>
+                    <a:stretch>
+                      <a:fillRect/>
+                    </a:stretch>
                   </pic:blipFill>
-                  <pic:spPr bwMode="auto">
+                  <pic:spPr>
                     <a:xfrm>
                       <a:off x="0" y="0"/>
-                      <a:ext cx="5940425" cy="4216857"/>
+                      <a:ext cx="5486400" cy="4315442"/>
                     </a:xfrm>
-                    <a:prstGeom prst="rect">
-                      <a:avLst/>
-                    </a:prstGeom>
-                    <a:noFill/>
-                    <a:ln>
-                      <a:noFill/>
-                    </a:ln>
-                    <a:extLst>
-                      <a:ext uri="{53640926-AAD7-44d8-BBD7-CCE9431645EC}">
-                        <a14:shadowObscured xmlns:a14="http://schemas.microsoft.com/office/drawing/2010/main" xmlns:w="http://schemas.openxmlformats.org/wordprocessingml/2006/main" xmlns:w10="urn:schemas-microsoft-com:office:word" xmlns:v="urn:schemas-microsoft-com:vml" xmlns:o="urn:schemas-microsoft-com:office:office" xmlns:mv="urn:schemas-microsoft-com:mac:vml" xmlns:mo="http://schemas.microsoft.com/office/mac/office/2008/main" xmlns=""/>
-                      </a:ext>
-                    </a:extLst>
+                    <a:prstGeom prst="rect"/>
                   </pic:spPr>
                 </pic:pic>
               </a:graphicData>
@@ -15633,11 +15608,22 @@
           <w:lang w:val="en-US"/>
         </w:rPr>
       </w:pPr>
+    </w:p>
+    <w:p>
+      <w:pPr>
+        <w:keepNext/>
+        <w:spacing w:before="120" w:line="276" w:lineRule="auto"/>
+        <w:jc w:val="center"/>
+        <w:rPr>
+          <w:rFonts w:ascii="Times New Roman" w:hAnsi="Times New Roman" w:cs="Times New Roman"/>
+          <w:lang w:val="en-US"/>
+        </w:rPr>
+      </w:pPr>
       <w:r>
         <w:drawing>
           <wp:inline xmlns:a="http://schemas.openxmlformats.org/drawingml/2006/main" xmlns:pic="http://schemas.openxmlformats.org/drawingml/2006/picture">
             <wp:extent cx="5029200" cy="5908253"/>
-            <wp:docPr id="17" name="Picture 17"/>
+            <wp:docPr id="19" name="Picture 19"/>
             <wp:cNvGraphicFramePr>
               <a:graphicFrameLocks noChangeAspect="1"/>
             </wp:cNvGraphicFramePr>
@@ -15645,7 +15631,7 @@
               <a:graphicData uri="http://schemas.openxmlformats.org/drawingml/2006/picture">
                 <pic:pic>
                   <pic:nvPicPr>
-                    <pic:cNvPr id="0" name="npsp_process_diagram.png"/>
+                    <pic:cNvPr id="0" name="image.png"/>
                     <pic:cNvPicPr/>
                   </pic:nvPicPr>
                   <pic:blipFill>
@@ -15670,61 +15656,6 @@
     </w:p>
     <w:p>
       <w:pPr>
-        <w:keepNext/>
-        <w:spacing w:before="120" w:line="276" w:lineRule="auto"/>
-        <w:jc w:val="center"/>
-        <w:rPr>
-          <w:rFonts w:ascii="Times New Roman" w:hAnsi="Times New Roman" w:cs="Times New Roman"/>
-          <w:lang w:val="en-US"/>
-        </w:rPr>
-      </w:pPr>
-      <w:r>
-        <w:rPr>
-          <w:rFonts w:ascii="Times New Roman" w:hAnsi="Times New Roman" w:cs="Times New Roman"/>
-          <w:noProof/>
-          <w:sz w:val="24"/>
-          <w:szCs w:val="24"/>
-          <w:lang w:val="en-US" w:eastAsia="en-US"/>
-        </w:rPr>
-        <w:drawing>
-          <wp:inline distT="0" distB="0" distL="0" distR="0" wp14:anchorId="7ED5DA42" wp14:editId="59C97927">
-            <wp:extent cx="4937397" cy="3982365"/>
-            <wp:effectExtent l="0" t="0" r="0" b="0"/>
-            <wp:docPr id="15" name="Image 15"/>
-            <wp:cNvGraphicFramePr>
-              <a:graphicFrameLocks xmlns:a="http://schemas.openxmlformats.org/drawingml/2006/main" noChangeAspect="1"/>
-            </wp:cNvGraphicFramePr>
-            <a:graphic xmlns:a="http://schemas.openxmlformats.org/drawingml/2006/main">
-              <a:graphicData uri="http://schemas.openxmlformats.org/drawingml/2006/picture">
-                <pic:pic xmlns:pic="http://schemas.openxmlformats.org/drawingml/2006/picture">
-                  <pic:nvPicPr>
-                    <pic:cNvPr id="1" name=""/>
-                    <pic:cNvPicPr/>
-                  </pic:nvPicPr>
-                  <pic:blipFill>
-                    <a:blip r:embed="rId13"/>
-                    <a:stretch>
-                      <a:fillRect/>
-                    </a:stretch>
-                  </pic:blipFill>
-                  <pic:spPr>
-                    <a:xfrm>
-                      <a:off x="0" y="0"/>
-                      <a:ext cx="4937397" cy="3982365"/>
-                    </a:xfrm>
-                    <a:prstGeom prst="rect">
-                      <a:avLst/>
-                    </a:prstGeom>
-                  </pic:spPr>
-                </pic:pic>
-              </a:graphicData>
-            </a:graphic>
-          </wp:inline>
-        </w:drawing>
-      </w:r>
-    </w:p>
-    <w:p>
-      <w:pPr>
         <w:pStyle w:val="Caption"/>
         <w:spacing w:before="120" w:after="120" w:line="276" w:lineRule="auto"/>
         <w:jc w:val="center"/>
@@ -17662,30 +17593,22 @@
         </w:rPr>
       </w:pPr>
       <w:r>
-        <w:rPr>
-          <w:rFonts w:ascii="Times New Roman" w:hAnsi="Times New Roman" w:cs="Times New Roman"/>
-          <w:noProof/>
-          <w:sz w:val="24"/>
-          <w:szCs w:val="24"/>
-          <w:lang w:val="en-US" w:eastAsia="en-US"/>
-        </w:rPr>
         <w:drawing>
-          <wp:inline distT="0" distB="0" distL="0" distR="0" wp14:anchorId="530CB1C2" wp14:editId="59523251">
-            <wp:extent cx="4235556" cy="2019300"/>
-            <wp:effectExtent l="0" t="0" r="0" b="0"/>
-            <wp:docPr id="16" name="Image 16"/>
+          <wp:inline xmlns:a="http://schemas.openxmlformats.org/drawingml/2006/main" xmlns:pic="http://schemas.openxmlformats.org/drawingml/2006/picture">
+            <wp:extent cx="5029200" cy="4118714"/>
+            <wp:docPr id="20" name="Picture 20"/>
             <wp:cNvGraphicFramePr>
-              <a:graphicFrameLocks xmlns:a="http://schemas.openxmlformats.org/drawingml/2006/main" noChangeAspect="1"/>
+              <a:graphicFrameLocks noChangeAspect="1"/>
             </wp:cNvGraphicFramePr>
-            <a:graphic xmlns:a="http://schemas.openxmlformats.org/drawingml/2006/main">
+            <a:graphic>
               <a:graphicData uri="http://schemas.openxmlformats.org/drawingml/2006/picture">
-                <pic:pic xmlns:pic="http://schemas.openxmlformats.org/drawingml/2006/picture">
+                <pic:pic>
                   <pic:nvPicPr>
-                    <pic:cNvPr id="1" name=""/>
+                    <pic:cNvPr id="0" name="npsp_subprocess_diagram.png"/>
                     <pic:cNvPicPr/>
                   </pic:nvPicPr>
                   <pic:blipFill>
-                    <a:blip r:embed="rId14"/>
+                    <a:blip r:embed="rId23"/>
                     <a:stretch>
                       <a:fillRect/>
                     </a:stretch>
@@ -17693,11 +17616,9 @@
                   <pic:spPr>
                     <a:xfrm>
                       <a:off x="0" y="0"/>
-                      <a:ext cx="4240170" cy="2021500"/>
+                      <a:ext cx="5029200" cy="4118714"/>
                     </a:xfrm>
-                    <a:prstGeom prst="rect">
-                      <a:avLst/>
-                    </a:prstGeom>
+                    <a:prstGeom prst="rect"/>
                   </pic:spPr>
                 </pic:pic>
               </a:graphicData>

</xml_diff>